<commit_message>
Proofcheck Inn Trouble Romanian: MINOR (19 fixes)
Co-Authored-By: Claude Opus 5.5 <noreply@anthropic.com>
Claude-Session: https://claude.ai/code/session_012Cm8JxdqzjuttdUSdkQCUg
</commit_message>
<xml_diff>
--- a/translated/corrected/Inn Trouble - ASSEMBLED - FORMATTED_Romanian.docx
+++ b/translated/corrected/Inn Trouble - ASSEMBLED - FORMATTED_Romanian.docx
@@ -127,7 +127,7 @@
     <w:p/>
     <w:p>
       <w:r>
-        <w:t>Jessica Claus pornește de la sursa de unde ar fi putut porni această taină, în loc să ia urma pe care orașul și-ar dori-o. Un fierar căruia i se datorau douăzeci de dolari și care refuza un răspuns direct. Un străin care împărțea pliante despre o broșă dispărută oricui voia să ia unul. Un istoric care dormea pe un pat de campanie lângă o centrală pe care nu-și permitea să o repare.</w:t>
+        <w:t xml:space="preserve">Jessica Claus pornește de la sursa de unde ar fi putut porni această taină, în loc să ia urma pe care orașul și-ar dori-o. Un fierar căruia i se datorau douăzeci de dolari și care refuza un răspuns direct. Un străin care împărțea cărți de vizită despre o broșă dispărută oricui voia să ia una. Un istoric care dormea pe un pat de campanie lângă o centrală pe care nu-și permitea să o repare.</w:t>
       </w:r>
     </w:p>
     <w:p/>
@@ -737,7 +737,7 @@
     <w:p/>
     <w:p>
       <w:r>
-        <w:t>— Unde ajung hârtiile vechi din acest oraș, Fiona? La urmă urmei? Când familiile care l-au stăpânit au dispărut sau nu le mai vor în drum?</w:t>
+        <w:t xml:space="preserve">— Unde ajung hârtiile vechi din acest oraș, Fiona? La urmă urmei? Când familiile care le-au deținut au dispărut sau nu le mai vor în drum?</w:t>
       </w:r>
     </w:p>
     <w:p/>
@@ -1476,7 +1476,7 @@
     </w:p>
     <w:p>
       <w:r>
-        <w:t>Dot a scos un sunet pe nas. — Primarul Blackburn crede că istoria e ceva ce s-a întâmplat altor oameni, în alt județ. O să taie o panglică la festival și o să-i strângă mâna lui Theo pentru fotografie. N-o să dea nici un cent ca să țină luminile aprinse restul anului. Să vezi.</w:t>
+        <w:t xml:space="preserve">Dot a scos un sunet pe nas. — Primarul Blackburn crede că istoria e ceva ce s-a întâmplat altor oameni, în alt județ. O să taie o panglică la festival și o să-i strângă mâna lui Theo pentru fotografie. N-o să dea niciun cent ca să țină luminile aprinse restul anului. Să vezi.</w:t>
       </w:r>
     </w:p>
     <w:p>
@@ -1506,7 +1506,7 @@
     </w:p>
     <w:p>
       <w:r>
-        <w:t>Andrelele Clairei s-au oprit. A ridicat privirea. Pentru o clipă, aerul de reporter i-a dispărut de pe chip și a apărut ceva mai vechi și mai obosit. — Poveștile triste nu scot banii la iveală, a spus ea încet. Am scris o sută ca ele. Îi fac pe oameni să simtă că au făcut ceva doar simțindu-se prost, și pe urmă întorc pagina. Apoi a scuturat din cap și vioiciunea i-a revenit. — Dar am s-o scriu cu blândețe. Merită blândețe, orice s-ar întâmpla.</w:t>
+        <w:t xml:space="preserve">Andrelele lui Claire s-au oprit. A ridicat privirea. Pentru o clipă, aerul de reporter i-a dispărut de pe chip și a apărut ceva mai vechi și mai obosit. — Poveștile triste nu scot banii la iveală, a spus ea încet. Am scris o sută ca ele. Îi fac pe oameni să simtă că au făcut ceva doar simțindu-se prost, și pe urmă întorc pagina. Apoi a scuturat din cap și vioiciunea i-a revenit. — Dar am s-o scriu cu blândețe. Merită blândețe, orice s-ar întâmpla.</w:t>
       </w:r>
     </w:p>
     <w:p>
@@ -1734,7 +1734,7 @@
     </w:p>
     <w:p>
       <w:r>
-        <w:t>M-am uitat la el un timp îndelungat. Pip venise și se așezase alături, s-a uitat și ea la el și și-a înclinat capul.</w:t>
+        <w:t xml:space="preserve">M-am uitat la el un timp îndelungat. Pip a venit și s-a așezat alături, s-a uitat și ea la el și și-a înclinat capul.</w:t>
       </w:r>
     </w:p>
     <w:p>
@@ -2352,7 +2352,7 @@
     <w:p/>
     <w:p>
       <w:r>
-        <w:t xml:space="preserve">— Eu nu sunt legea, doamnă Claus, și nu sunt preot, și cu siguranță nu sunt conștiința unei fete care o fi moartă de multă vreme. Eu urmăresc unde au ajuns lucrurile. Ce au făcut oamenii ca să le ducă acolo și dacă au avut dreptate sau nu făcând asta, asta ține doar de ei și de cine o da socoteală, și pe deasupra s-a și învechit de o sută de ani. N-am niciun interes să fac de rușine o slugă moartă pentru că a fost săracă. </w:t>
+        <w:t xml:space="preserve">— Eu nu sunt legea, doamnă Claus, și nu sunt preot, și cu siguranță nu sunt conștiința unei fete care o fi moartă de multă vreme. Eu urmăresc unde au ajuns lucrurile. Ce au făcut oamenii ca să le ducă acolo și dacă au avut dreptate sau nu făcând asta, asta ține doar de ei și de cel căruia îi dau socoteală, și pe deasupra s-a și învechit de o sută de ani. N-am niciun interes să fac de rușine o slugă moartă pentru că a fost săracă. </w:t>
       </w:r>
     </w:p>
     <w:p/>
@@ -3127,7 +3127,7 @@
     <w:p/>
     <w:p>
       <w:r>
-        <w:t xml:space="preserve">— Chemată acasă, a zis el. Păi. Asta nu e cel mai rău lucru pe care l-ar putea face o jivină, presupun. Sau un elf. </w:t>
+        <w:t xml:space="preserve">— Chemată acasă, a zis el. Păi. Asta nu e cel mai rău lucru pe care l-ar putea face o jivină, presupun. Sau un spiriduș. </w:t>
       </w:r>
     </w:p>
     <w:p/>
@@ -3303,7 +3303,7 @@
     </w:p>
     <w:p>
       <w:r>
-        <w:t>Capul Clairei s-a ridicat.</w:t>
+        <w:t xml:space="preserve">Capul lui Claire s-a ridicat.</w:t>
       </w:r>
     </w:p>
     <w:p>
@@ -3664,7 +3664,7 @@
     <w:p/>
     <w:p>
       <w:r>
-        <w:t>— O jumătate de milion. — S-a lăsat pe spătar și a scos un șuierat prelung. — Dumnezeule mare. Cineva stoarce descendentul. Pentru o chestie pe care legea n-o poate atinge. — A clătinat încet din cap și în gestul lui era dezgust, un dezgust adevărat. — Asta e crud, doamnă Claus, și e prostesc. Nu există nicio acuzație pe care să o poată aduce cineva pentru broșa aceea acum. Moștenirea Blackburn nu vrea banii prietenei dumneavoastră și cu siguranță nu vrea pielea ei. Vrea un singur rând într-un catastif care să indice unde a ajuns piesa, ca avocații să poată închide dosarul și să nu se mai factureze unii pe alții. Oricine îi suge sângele prietenei dumneavoastră îi vinde o teroare care nu e nici măcar reală. Rușinea e singura armă din ea. Nu mai există niciun temei juridic, nu după o sută de ani.</w:t>
+        <w:t xml:space="preserve">— O jumătate de milion. — S-a lăsat pe spătar și a scos un șuierat prelung. — Dumnezeule mare. Cineva o stoarce pe descendentă. Pentru o chestie pe care legea n-o poate atinge. — A clătinat încet din cap și în gestul lui era dezgust, un dezgust adevărat. — Asta e crud, doamnă Claus, și e prostesc. Nu există nicio acuzație pe care să o poată aduce cineva pentru broșa aceea acum. Moștenirea Blackburn nu vrea banii prietenei dumneavoastră și cu siguranță nu vrea pielea ei. Vrea un singur rând într-un catastif care să indice unde a ajuns piesa, ca avocații să poată închide dosarul și să nu se mai factureze unii pe alții. Oricine îi suge sângele prietenei dumneavoastră îi vinde o teroare care nu e nici măcar reală. Rușinea e singura armă din ea. Nu mai există niciun temei juridic, nu după o sută de ani.</w:t>
       </w:r>
     </w:p>
     <w:p/>
@@ -3682,7 +3682,7 @@
     <w:p/>
     <w:p>
       <w:r>
-        <w:t>— V-am spus în prima zi. Eu urmăresc pe unde au ajuns lucrurile. Restul e între oameni și oricine o fi răspunzând ei. — A tras un dosar gros din teancul lui și, după o clipă de gândire, l-a împins pe masă spre mine. — Poftiți. S-ar putea la fel de bine să-l aveți, din moment ce suntem sinceri unul cu celălalt și din moment ce vreun hoț de doi bani din drăguțul dumneavoastră oraș folosește jumătatea lui cea mai rea ca să chinuiască o femeie cumsecade. E tot ce am scos la iveală despre servitoare. Constance Okafor.</w:t>
+        <w:t xml:space="preserve">— V-am spus în prima zi. Eu urmăresc pe unde au ajuns lucrurile. Restul e între oameni și cel căruia îi dau socoteală. — A tras un dosar gros din teancul lui și, după o clipă de gândire, l-a împins pe masă spre mine. — Poftiți. S-ar putea la fel de bine să-l aveți, din moment ce suntem sinceri unul cu celălalt și din moment ce vreun hoț de doi bani din drăguțul dumneavoastră oraș folosește jumătatea lui cea mai rea ca să chinuiască o femeie cumsecade. E tot ce am scos la iveală despre servitoare. Constance Okafor.</w:t>
       </w:r>
     </w:p>
     <w:p/>
@@ -4182,7 +4182,7 @@
     </w:p>
     <w:p>
       <w:r>
-        <w:t>— Păreați gata s-o pui la pământ pe doamna Pelletier, a spus ea.</w:t>
+        <w:t xml:space="preserve">— Păreați gata s-o puneți la pământ pe doamna Pelletier, a spus ea.</w:t>
       </w:r>
     </w:p>
     <w:p>
@@ -4291,12 +4291,12 @@
       </w:r>
       <w:r/>
       <w:r>
-        <w:t xml:space="preserve"> exprimarea unui istoric, nu a unui hoț, aflate în biletul de șantaj exact la fel ca pe fișa scrisă cu mâna îngrijită și aplecată a lui Theo. Biletul fusese scris pe hârtia cu antet de culoare crem a Societății, hârtia aceea groasă și vergată pe care îl văzusem stivuit pe tejghea la intrarea în expoziție. Omul care conducea arhiva se scufunda. Bătuse la orice ușă cinstită din trei state și văzuse cum se închid toate. Se ridicase în fața întregului oraș și anunțase, cu părere de rău, că tocmai scrisorile în care era descrisă broșa rătăciseră calea.</w:t>
-      </w:r>
-    </w:p>
-    <w:p>
-      <w:r>
-        <w:t>Fiecare drum din toată această tărășenie ducea la aceeași ușă. O luasem pe fiecare în parte sperând că vreunul avea să cotească în altă parte înainte de a ajunge acolo, dar niciunul n-o făcuse.</w:t>
+        <w:t xml:space="preserve"> exprimarea unui istoric, nu a unui hoț, aflate în biletul de șantaj exact la fel ca pe fișa scrisă cu mâna îngrijită și aplecată a lui Theo. Biletul fusese scris pe hârtia cu antet de culoare crem a Societății, hârtia aceea groasă și vergată pe care o văzusem stivuită pe tejghea la intrarea în expoziție. Omul care conducea arhiva se scufunda. Bătuse la orice ușă cinstită din trei state și văzuse cum se închid toate. Se ridicase în fața întregului oraș și anunțase, cu părere de rău, că tocmai scrisorile în care era descrisă broșa rătăciseră calea.</w:t>
+      </w:r>
+    </w:p>
+    <w:p>
+      <w:r>
+        <w:t xml:space="preserve">Fiecare drum din toată această tărășenie ducea la aceeași ușă. Pornisem pe fiecare dintre ele, sperând că vreunul avea să cotească în altă parte înainte de a ajunge acolo, dar niciunul n-o făcuse.</w:t>
       </w:r>
     </w:p>
     <w:p>
@@ -4814,7 +4814,7 @@
     <w:p/>
     <w:p>
       <w:r>
-        <w:t>— Theo, am spus. Biletele de șantaj trimise Fionei au fost scrise pe hârtia de scrisori a Societății. Hârtia aceea groasă, crem, cu dungi de sită. L-am potrivit fibră cu fibră cu o foaie din stocul tău. — A tresărit, dar am continuat, fermă. — Și descriu broșa ca fiind safirul din inima ei. Acestea sunt cuvintele tale, Theo.</w:t>
+        <w:t xml:space="preserve">— Theo, am spus. Biletele de șantaj trimise Fionei au fost scrise pe hârtia de scrisori a Societății. Hârtia aceea groasă, crem, cu dungi de sită. Am potrivit-o fibră cu fibră cu o foaie din stocul tău. — A tresărit, dar am continuat, fermă. — Și descriu broșa ca fiind safirul din inima ei. Acestea sunt cuvintele tale, Theo.</w:t>
       </w:r>
       <w:r/>
       <w:r/>
@@ -4832,7 +4832,7 @@
     <w:p/>
     <w:p>
       <w:r>
-        <w:t>— Mi-am spus că nu era chiar furt, a zis el. Nu de la Fiona. Mi-am spus că hanul fusese cumpărat oricum cu bani furați la origine, așa că a lua o parte înapoi nu era jaf, era, nu știu, istoria care se corecta pe sine, o scadență care venea în sfârșit la plată. Mă pricep atât de bine să fac trecutul să însemne orice am nevoie să însemne. Asta e toată pregătirea mea, să fac trecutul să aibă sens. — Și-a apăsat pumnii pe ochi ca un copil. — Acoperișul se dărâmă. Centrala e pe ducă. O sută de ani din memoria acestui oraș, fiecare scrisoare, fotografie și act, totul se duce de râpă, și fiecare ușă cinstită la care am bătut mi s-a închis în nas, primarul, fondurile, fundațiile, fiecare în parte. Și pe urmă am găsit scrisorile acelea, și iată-le, o jumătate de milion de dolari, stând pur și simplu acolo în trecut, și m-am gândit că pot să o salvez. Pot să salvez totul, fiecare fărâmă, și nimeni nu pățește cu adevărat nimic, pentru că banii erau murdari de la bun început. — A ridicat privirea, nenorocit. — Și pe urmă m-am uitat la ce-i făcea ei. Fionei. Am privit-o cum se face cenușie la față. Și mi-am zis că o să mă opresc, și n-am făcut-o, pentru că până atunci eram deja implicat în asta, iar odată ce o făcusem, mi-am spus că încă una n-ar mai conta. — S-a întors spre Fiona, iar vocea i s-a frânt. — Îmi pare atâta de rău. Îmi pare nespus de rău, Fiona. M-am pierdut pe undeva prin asta. Iubesc atât de mult istoria acestui oraș, încât am uitat că orașul e făcut din oameni în carne și oase.</w:t>
+        <w:t xml:space="preserve">— Mi-am spus că nu era chiar furt, a zis el. Nu de la Fiona. Mi-am spus că hanul fusese cumpărat oricum cu bani furați la origine, așa că a lua o parte înapoi nu era jaf, era, nu știu, istoria care se corecta pe sine, o scadență care venea în sfârșit la plată. Mă pricep atât de bine să fac trecutul să însemne orice am nevoie să însemne. Asta e toată pregătirea mea, să fac trecutul să aibă sens. — Și-a apăsat pumnii pe ochi ca un copil. — Acoperișul se dărâmă. Centrala e pe ducă. O sută de ani din memoria acestui oraș, fiecare scrisoare, fotografie și act, totul se duce de râpă, și fiecare ușă cinstită la care am bătut mi s-a închis în nas, primarul, fondurile, fundațiile, fiecare în parte. Și pe urmă am găsit scrisorile acelea, și iată-le, o jumătate de milion de dolari, stând pur și simplu acolo în trecut, și m-am gândit că pot să o salvez. Pot să salvez totul, fiecare fărâmă, și nimeni nu pățește cu adevărat nimic, pentru că banii erau murdari de la bun început. — A ridicat privirea, nenorocit. — Și pe urmă m-am uitat la ce-i făcea ei. Fionei. Am privit-o cum se face cenușie la față. Și mi-am zis că o să mă opresc, și n-am făcut-o, pentru că până atunci eram deja implicat în asta, iar odată ce o făcusem, mi-am spus că încă unul n-ar mai conta. — S-a întors spre Fiona, iar vocea i s-a frânt. — Îmi pare atâta de rău. Îmi pare nespus de rău, Fiona. M-am pierdut pe undeva prin asta. Iubesc atât de mult istoria acestui oraș, încât am uitat că orașul e făcut din oameni în carne și oase.</w:t>
       </w:r>
     </w:p>
     <w:p/>
@@ -4987,13 +4987,13 @@
     <w:p/>
     <w:p>
       <w:r>
-        <w:t>Ar fi trebuit să fie sfârșitul. Dar mai exista încă problema Societății însăși, exact lucrul pe care Theo îl ruinase încercând să-l salveze. El dispăruse de acolo acum. Acoperișul lăsa în continuare ploaia să intre, iar centrala termică dădea încă să se strice, și nimic din toată această socoteală nu pusese măcar un dolar pentru vreuna dintre ele.</w:t>
-      </w:r>
-    </w:p>
-    <w:p/>
-    <w:p>
-      <w:r>
-        <w:t>Lucrul pe care îl făcuse greșit ca să o salveze continua să se prăbușească. Și acum, odată cu plecarea lui, trebuia salvat așa cum trebuie, de către oraș, pentru orașul în sine. Altfel, nu va fi salvat nicicum.</w:t>
+        <w:t xml:space="preserve">Ar fi trebuit să fie sfârșitul. Dar mai exista încă problema Societății însăși, exact lucrul pe care Theo se ruinase încercând să-l salveze. El dispăruse de acolo acum. Acoperișul lăsa în continuare ploaia să intre, iar centrala termică dădea încă să se strice, și nimic din toată această socoteală nu pusese măcar un dolar pentru vreuna dintre ele.</w:t>
+      </w:r>
+    </w:p>
+    <w:p/>
+    <w:p>
+      <w:r>
+        <w:t xml:space="preserve">Lucrul pentru a cărui salvare greșise continua să se prăbușească. Și acum, odată cu plecarea lui, trebuia salvat așa cum trebuie, de către oraș, pentru orașul în sine. Altfel, nu va fi salvat nicicum.</w:t>
       </w:r>
     </w:p>
     <w:p>
@@ -5728,7 +5728,7 @@
     <w:p/>
     <w:p>
       <w:r>
-        <w:t>Ninsese în timpul nopții. Nu ninsoarea aia timpurie din octombrie, care dispăruse iar într-o serie de zile blânde. Zăpadă adevărată. Genul acela din mijlocul sezonului care începuse de Halloween și avea să țină până în primăvară. Se așeza acum de-a lungul bulevardului Evergreen într-un strat frumos și curat de vreo cincisprezece centimetri, scârțâind sub tălpi când intra cineva bătând din picioare. Peste weekend, magazinele își schimbaseră scheleții și felinarele dovleac pe coceni de porumb și curcani de hârtie, deși dovlecii simpli rămăseseră pe trepte, buni până de Ziua Recunoștinței. Bulevardul se liniștise după Halloween, în pauza dinaintea lungului și strălucitorului avânt spre Crăciun.</w:t>
+        <w:t xml:space="preserve">Ninsese în timpul nopții. Nu ninsoarea aia timpurie din octombrie, care dispăruse iar într-o serie de zile blânde. Zăpadă adevărată. Genul acela din mijlocul sezonului care începuse de Halloween și avea să țină până în primăvară. Se așeza acum de-a lungul Bulevardului Evergreen într-un strat frumos și curat de vreo cincisprezece centimetri, scârțâind sub tălpi când intra cineva bătând din picioare. Peste weekend, magazinele își schimbaseră scheleții și felinarele dovleac pe coceni de porumb și curcani de hârtie, deși dovlecii simpli rămăseseră pe trepte, buni până de Ziua Recunoștinței. Bulevardul se liniștise după Halloween, în pauza dinaintea lungului și strălucitorului avânt spre Crăciun.</w:t>
       </w:r>
     </w:p>
     <w:p/>
@@ -6032,7 +6032,7 @@
     <w:p/>
     <w:p>
       <w:r>
-        <w:t>— Le-au periat în urma lor. Sau vântul le-a umplut. E o glumă. Un copil cu degete înghețate care n-are altceva mai bun de făcut. Până duminică o să fie un rând întreg întoarse, țineți minte, odată ce ceilalți văd că se poate face.</w:t>
+        <w:t xml:space="preserve">— Le-au periat în urma lor. Sau vântul le-a umplut. E o glumă. Un copil cu degete înghețate care n-are altceva mai bun de făcut. Până duminică o să fie un rând întreg întors, țineți minte, odată ce ceilalți văd că se poate face.</w:t>
       </w:r>
     </w:p>
     <w:p/>

</xml_diff>

<commit_message>
Full proofcheck Inn Trouble Romanian: SIGNIFICANT (89 fixes)
Co-Authored-By: Claude Opus 5.5 <noreply@anthropic.com>
Claude-Session: https://claude.ai/code/session_012Cm8JxdqzjuttdUSdkQCUg
</commit_message>
<xml_diff>
--- a/translated/corrected/Inn Trouble - ASSEMBLED - FORMATTED_Romanian.docx
+++ b/translated/corrected/Inn Trouble - ASSEMBLED - FORMATTED_Romanian.docx
@@ -234,7 +234,7 @@
     </w:p>
     <w:p>
       <w:r>
-        <w:t>Ușa de la intrare s-a deschis lăsând să intre un val de aer rece care a făcut ca flacăra din șemineu să pâlpâie, iar un cuplu a intrat. Totul la Fiona s-a schimbat pe loc. S-a îndreptat. A pus coșul pe recepție. Zâmbetul pe care l-a găsit pentru noii veniți era adevărat, sau suficient de aproape de adevăr încât doar cineva care se uita cu mare atenție să fi observat efortul din spatele lui.</w:t>
+        <w:t xml:space="preserve">Ușa de la intrare s-a deschis lăsând să intre un val de aer rece care a făcut ca flacăra din șemineu să pâlpâie, iar un cuplu a intrat. Totul la Fiona s-a schimbat pe loc. S-a îndreptat. A pus coșul pe recepție. Zâmbetul pe care l-a găsit pentru noii veniți era adevărat, sau suficient de aproape de adevăr încât doar cineva care se uita cu mare atenție ar fi observat efortul din spatele lui.</w:t>
       </w:r>
     </w:p>
     <w:p>
@@ -304,7 +304,7 @@
     </w:p>
     <w:p>
       <w:r>
-        <w:t>Douăzeci de dolari. Am întors suma asta în minte ca pe o piatră găsită în pantof. Era o sumă atât de mică încât să bage atâta tensiune în vocile a doi oameni de treabă. Sam nu era un bărbat care să bată la cap un prieten pentru douăzeci de dolari. Fiona nu era o femeie care să lase o factură neplătită trei săptămâni. Ceva se stricase în adâncul ființei amândurora.</w:t>
+        <w:t xml:space="preserve">Douăzeci de dolari. Am întors suma asta în minte ca pe o piatră găsită în pantof. Era o sumă prea mică pentru a pune atâta tensiune în vocile a doi oameni de treabă. Sam nu era un bărbat care să bată la cap un prieten pentru douăzeci de dolari. Fiona nu era o femeie care să lase o factură neplătită trei săptămâni. Ceva se stricase în adâncul ființei amândurora.</w:t>
       </w:r>
     </w:p>
     <w:p>
@@ -501,7 +501,7 @@
     </w:p>
     <w:p>
       <w:r>
-        <w:t>Am acoperit foaia de aluat întinsă cu o cârpă umedă, ca să nu se usuce, și mi-am luat haina din cuiul de lângă ușă. Pip fusese acolo înainte să apuc să închei primul nasture, legănându-se într-un cerc strâns și plin de anxietate.</w:t>
+        <w:t xml:space="preserve">Am acoperit foaia de aluat întinsă cu o cârpă umedă, ca să nu se usuce, și mi-am luat haina din cuiul de lângă ușă. Pip era deja acolo înainte să apuc să închei primul nasture, legănându-se într-un cerc strâns și plin de anxietate.</w:t>
       </w:r>
     </w:p>
     <w:p>
@@ -521,7 +521,7 @@
     </w:p>
     <w:p>
       <w:r>
-        <w:t>Am împins ușa grea de la intrare, iar scârțâitul ei cunoscut a părut prea tare în foiala înăbușită a holului. Focul era aprins, dar abia ce fusese pus, și nu era niciun alt oaspete prin preajmă încă, doar femeia în vârstă de ieri, în același scaun de lângă șemineu, cu aceeași carte de buzunar. S-a uitat la mine peste ochelarii de lectură cu curiozitatea sinceră a cuiva care n-avea altceva de făcut decât să urmărească holul, iar ochii ei m-au urmărit tot drumul de-a lungul camerei. Nu mi-a plăcut niciodată să fiu privită într-un loc care ar trebui să fie prietenos, și mi-a plăcut și mai puțin în dimineața aceea.</w:t>
+        <w:t xml:space="preserve">Am împins ușa grea de la intrare, iar scârțâitul ei cunoscut a părut prea tare în liniștea holului. Focul era aprins, dar abia ce fusese pus, și nu era niciun alt oaspete prin preajmă încă, doar femeia în vârstă de ieri, în același scaun de lângă șemineu, cu aceeași carte de buzunar. S-a uitat la mine peste ochelarii de lectură cu curiozitatea sinceră a cuiva care n-avea altceva de făcut decât să urmărească holul, iar ochii ei m-au urmărit tot drumul de-a lungul camerei. Nu mi-a plăcut niciodată să fiu privită într-un loc care ar trebui să fie prietenos, și mi-a plăcut și mai puțin în dimineața aceea.</w:t>
       </w:r>
     </w:p>
     <w:p>
@@ -551,7 +551,7 @@
     </w:p>
     <w:p>
       <w:r>
-        <w:t xml:space="preserve">Era un bilet. Scrisul de mână era în mod deliberat urât, numai linii strâmbe și inegale și litere rupte, stângăcia aceea studiată pe care o face cineva când se străduiește din răsputeri să-și disimuleze scrisul. Suma a fost primul lucru pe care l-am văzut, pentru că oricine o scrisese voise ca suma să fie primul lucru pe care oricine îl vedea. Cinci sute de mii de dolari. Și dedesubt, în același scrijelit chinuit, restul. </w:t>
+        <w:t xml:space="preserve">Era un bilet. Scrisul de mână era în mod deliberat urât, numai linii strâmbe și inegale și litere rupte, stângăcia aceea studiată pe care o face cineva când se străduiește din răsputeri să-și disimuleze scrisul. Suma a fost primul lucru pe care l-am văzut, pentru că oricine îl scrisese voise ca suma să fie primul lucru pe care oricine îl vedea. Cinci sute de mii de dolari. Și dedesubt, în același scrijelit chinuit, restul. </w:t>
       </w:r>
       <w:r>
         <w:rPr>
@@ -609,7 +609,7 @@
     </w:p>
     <w:p>
       <w:r>
-        <w:t>— Nu. — Vocea Fionei s-a gâtuit. — Nu, e o Blackburn. Una dintre vechile Blackburn, de pe vremea când aveau toți banii din județ. Nici măcar nu știu cum o chema. — A atins marginea maronie a fotografiei. — Constance a păstrat-o toți anii aceștia. Cred că de vină a fost broșa de care nu s-a putut despărți, nu femeia. Dar broșa pe care o poartă. — Și-a apăsat mâna plat pe piept, de parcă o durea acolo. — Broșa e a noastră, Jessica. Asta e ceea ce folosesc împotriva mea. Broșa aceea.</w:t>
+        <w:t xml:space="preserve">— Nu. — Vocea Fionei s-a gâtuit. — Nu, e o Blackburn. Una dintre vechile Blackburn, de pe vremea când aveau toți banii din județ. Nici măcar nu știu cum o chema. — A atins marginea maronie a fotografiei. — Constance a păstrat-o toți anii aceștia. Cred că broșa a fost cea de care nu s-a putut despărți, nu femeia. Dar broșa pe care o poartă. — Și-a apăsat mâna plat pe piept, de parcă o durea acolo. — Broșa e a noastră, Jessica. Asta e ceea ce folosesc împotriva mea. Broșa aceea.</w:t>
       </w:r>
     </w:p>
     <w:p>
@@ -731,13 +731,13 @@
     <w:p/>
     <w:p>
       <w:r>
-        <w:t>— Actele familiei Blackburn, a spus ea în șoaptă.</w:t>
-      </w:r>
-    </w:p>
-    <w:p/>
-    <w:p>
-      <w:r>
-        <w:t xml:space="preserve">— Unde ajung hârtiile vechi din acest oraș, Fiona? La urmă urmei? Când familiile care le-au deținut au dispărut sau nu le mai vor în drum?</w:t>
+        <w:t xml:space="preserve">— Documentele familiei Blackburn, a spus ea în șoaptă.</w:t>
+      </w:r>
+    </w:p>
+    <w:p/>
+    <w:p>
+      <w:r>
+        <w:t xml:space="preserve">— Unde ajung hârtiile vechi din acest oraș, Fiona? Până la urmă? Când familiile care le-au deținut au dispărut sau nu le mai vor în drum?</w:t>
       </w:r>
     </w:p>
     <w:p/>
@@ -785,7 +785,7 @@
     <w:p/>
     <w:p>
       <w:r>
-        <w:t>A încuviințat din cap, neputând să scoată o vorbă, și am lăsat-o să tacă. Ceasul a ticăit, focul s-a așezat în foaierul de dincolo de ușă, Pip stătea sprijinită cu căldură de piciorul ei, iar pentru o clipă prietena mea n-a mai fost singură cu toate astea.</w:t>
+        <w:t xml:space="preserve">A încuviințat din cap, neputând să scoată o vorbă, și am lăsat-o să tacă. Ceasul a ticăit, focul s-a așezat în holul de dincolo de ușă, Pip stătea sprijinită cu căldură de piciorul ei, iar pentru o clipă prietena mea n-a mai fost singură cu toate astea.</w:t>
       </w:r>
     </w:p>
     <w:p/>
@@ -892,7 +892,7 @@
     <w:p/>
     <w:p>
       <w:r>
-        <w:t>— Atunci iată un alt lucru care e adevărat, și s-ar putea să te ajute. — S-a aplecat în față. — O mulțime de mâini răsfoiesc cutiile alea, Jess. Voluntarii vin și pleacă. Cercetătorii scriu dinainte și stau câte o săptămână. Copiii de școală în excursii educative. Oricine e primit de Theo pe ușă, iar Theo primește pe toată lumea, pentru că pentru el un străin interesat e cel mai bun lucru care i se poate întâmpla unei marți. Așadar, faptul că secretul a ieșit la iveală din actele familiei Blackburn nu înseamnă neapărat că a fost Theo. Îți arată doar unde să te uiți. Îți arată fântâna din care s-a scos apa. Acum trebuie să afli a cui găleată a coborât în ea.</w:t>
+        <w:t xml:space="preserve">— Atunci iată un alt lucru care e adevărat, și s-ar putea să te ajute. — S-a aplecat în față. — O mulțime de mâini răsfoiesc cutiile alea, Jess. Voluntarii vin și pleacă. Cercetătorii scriu dinainte și stau câte o săptămână. Copiii de școală în excursii educative. Oricine e primit de Theo pe ușă, iar Theo primește pe toată lumea, pentru că pentru el un străin interesat e cel mai bun lucru care i se poate întâmpla unei marți. Așadar, faptul că secretul a ieșit la iveală din documentele familiei Blackburn nu înseamnă neapărat că a fost Theo. Îți arată doar unde să te uiți. Îți arată fântâna din care s-a scos apa. Acum trebuie să afli a cui găleată a coborât în ea.</w:t>
       </w:r>
     </w:p>
     <w:p/>
@@ -910,7 +910,7 @@
     <w:p/>
     <w:p>
       <w:r>
-        <w:t>— Atunci jumătate de oraș e un loc minunat de unde să începi, a zis Nick, iar colțul gurii i s-a ridicat, deși restul feței i-a rămas grav. Mănâncă-ți supa. Gândești mai limpede când ești sătulă. Ai gândit mereu. Ai rezolvat toată treaba cu copilul familiei Redfern mâncând o porție din fursecurile mele cu ghimbir, dacă îți amintești, și ți-ai arogat toate meritele pe deasupra.</w:t>
+        <w:t xml:space="preserve">— Atunci jumătate de oraș e un loc minunat de unde să începi, a zis Nick, iar colțul gurii i s-a ridicat, deși restul feței i-a rămas grav. Mănâncă-ți supa. Gândești mai limpede când ești sătulă. Întotdeauna a fost așa. Ai rezolvat toată treaba cu copilul familiei Redfern mâncând o porție din fursecurile mele cu ghimbir, dacă îți amintești, și ți-ai arogat toate meritele pe deasupra.</w:t>
       </w:r>
     </w:p>
     <w:p/>
@@ -976,7 +976,7 @@
     <w:p/>
     <w:p>
       <w:r>
-        <w:t>Luminile de festival de deasupra acoperișurilor îndepărtate, șirurile pe care bărbații le spânzuraseră între stâlpii de iluminat din parcul central, ardeau într-o lumină aurie în loc de portocaliu, un auriu profund și stabil, fiecare șir în parte, de la parc până la gară, pe cât de mult vedeam cu ochii.</w:t>
+        <w:t xml:space="preserve">Luminile de festival de deasupra acoperișurilor îndepărtate, șirurile pe care bărbații le agățaseră între stâlpii de iluminat din parcul central, ardeau într-o lumină aurie în loc de portocaliu, un auriu profund și stabil, fiecare șir în parte, de la parc până la gară, pe cât de mult vedeam cu ochii.</w:t>
       </w:r>
     </w:p>
     <w:p/>
@@ -1237,7 +1237,7 @@
     </w:p>
     <w:p>
       <w:r>
-        <w:t xml:space="preserve">— Un bărbat a venit la mine adineauri, la masa cu suc de mere, și mi-a spus că familia Blackburn a deținut odată jumătate din Maple Street. Știați asta? Oamenilor le place să-ți spună ce dețineau familiile bogate. Niciodată nu pot să-ți spună ce le-au făcut familiile bogate celor care au muncit pentru ele. Partea aceea nu ajunge în actele de familie. </w:t>
+        <w:t xml:space="preserve">— Un bărbat a venit la mine adineauri, la masa cu suc de mere, și mi-a spus că familia Blackburn a deținut odată jumătate din Maple Street. Știați asta? Oamenilor le place să-ți spună ce dețineau familiile bogate. Niciodată nu pot să-ți spună ce le-au făcut familiile bogate celor care au muncit pentru ele. Partea aceea nu ajunge în documentele de familie. </w:t>
       </w:r>
     </w:p>
     <w:p>
@@ -1259,7 +1259,7 @@
     <w:p/>
     <w:p>
       <w:r>
-        <w:t>Apoi Theo a ciocănit cu o linguriță într-un pahar în fața încăperii. Mulțimea s-a întors și s-a liniștit, iar el și-a rostit scurtele cuvinte, care n-au fost deloc puține. Theo nu putea spune nimic despre trecut pe scurt. Și-a mulțumit voluntarilor pe nume, pe toți, inclusiv unei doamne Pelletier care, chipurile, sortase fotografii trei weekenduri la rând și se făcuse roșie ca focul când fusese menționată. A mulțumit orașului. A mulțumit, cu un nod în gât, „fiecărui om care a păstrat vreodată o scrisoare în loc s-o arunce, pentru că asta e tot ce înseamnă istoria, la urma urmei, lucrurile pe care oamenii nu le-au putut îndura să le arunce”.</w:t>
+        <w:t xml:space="preserve">Apoi Theo a ciocănit cu o linguriță într-un pahar în fața încăperii. Mulțimea s-a întors și s-a liniștit, iar el și-a rostit scurtele cuvinte, care n-au fost deloc puține. Theo nu putea spune nimic despre trecut pe scurt. Și-a mulțumit voluntarilor pe nume, pe toți, inclusiv unei doamne Pelletier care, se pare, sortase fotografii trei weekenduri la rând și se făcuse roșie ca focul când fusese menționată. A mulțumit orașului. A mulțumit, cu un nod în gât, „fiecărui om care a păstrat vreodată o scrisoare în loc s-o arunce, pentru că asta e tot ce înseamnă istoria, la urma urmei, lucrurile pe care oamenii nu le-au putut îndura să le arunce”.</w:t>
       </w:r>
     </w:p>
     <w:p/>
@@ -1309,7 +1309,7 @@
     <w:p/>
     <w:p>
       <w:r>
-        <w:t>Eu n-am râs. Am stat nemișcată în mijlocul încăperii calde și pline de veselie și am simțit cum frigul îmi urcă prin corp, pentru că cele mai interesante scrisori ale familiei Blackburn, cele care ar fi spus că o broșă a dispărut și unde ajunsese, se rătăciseră. Iar împăturită în buzunarul interior al hainei mele se afla un bilet de șantaj care știa exact ce spuneau acele scrisori.</w:t>
+        <w:t xml:space="preserve">Eu n-am râs. Am stat nemișcată în mijlocul încăperii calde și pline de veselie și am simțit cum frigul îmi urcă prin corp, pentru că cele mai interesante scrisori ale familiei Blackburn, cele care ar fi spus că o broșă a dispărut și unde ajunsese, se rătăciseră. Iar împăturit în buzunarul interior al hainei mele se afla un bilet de șantaj care știa exact ce spuneau acele scrisori.</w:t>
       </w:r>
     </w:p>
     <w:p/>
@@ -1321,13 +1321,13 @@
     <w:p/>
     <w:p>
       <w:r>
-        <w:t>Hârtia din vitrine era veche, maronie, casantă la îndoituri. Dar pe biroul din față, lângă cutia plată a Verei, se afla un teanc de hârtie cu antetul Societății, stocul necompletat pe care îl foloseau pentru etichete și antet, de culoare crem, puțin mai grea decât hârtia obișnuită, cu o textură vergată discretă presată în ea, linii paralele fine pe care le-ai fi observat doar dacă o țineai în lumină sau dacă aveai un motiv să te uiți.</w:t>
-      </w:r>
-    </w:p>
-    <w:p/>
-    <w:p>
-      <w:r>
-        <w:t>Aveam un motiv să mă uit. Ținusem în mână o foaie din acea hârtie exactă în dimineața de dinainte, cu o cerere de o jumătate de milion de dolari scrisă pe ea într-un scris de mână hidos și deghizat.</w:t>
+        <w:t xml:space="preserve">Hârtia din vitrine era veche, maronie, casantă la îndoituri. Dar pe biroul din față, lângă cutia plată a Verei, se afla un teanc din hârtia de corespondență a Societății, hârtia albă pe care o foloseau pentru etichete și pentru antet, de culoare crem, puțin mai grea decât hârtia obișnuită, cu o textură vergată discretă presată în ea, linii paralele fine pe care le-ai fi observat doar dacă o țineai în lumină sau dacă aveai un motiv să te uiți.</w:t>
+      </w:r>
+    </w:p>
+    <w:p/>
+    <w:p>
+      <w:r>
+        <w:t xml:space="preserve">Aveam un motiv să mă uit. Ținusem în mână o foaie exact din hârtia aceea în dimineața de dinainte, cu o cerere de o jumătate de milion de dolari scrisă pe ea într-un scris de mână hidos și deghizat.</w:t>
       </w:r>
     </w:p>
     <w:p/>
@@ -1351,7 +1351,7 @@
     <w:p/>
     <w:p>
       <w:r>
-        <w:t>Panglică roșie. Dintre toate panglicile dintr-o clădire împodobită cu auriu și portocaliu, ea se dusese și găsise tocmai bucla aceea de roșu. Până la urmă i-am smuls-o, cu blândețe, și am ținut-o în mână, o mică spirală strălucitoare de satin roșu, exact roșul pe care biletul îi spusese Fionei să-l agațe la coroniță, ca șantajistul să știe că banii așteptau sub trepte.</w:t>
+        <w:t xml:space="preserve">Panglică roșie. Dintre toate panglicile dintr-o clădire împodobită cu auriu și portocaliu, ea se dusese și găsise tocmai bucla aceea de roșu. Până la urmă i-am luat-o, cu blândețe, și am ținut-o în mână, o mică spirală strălucitoare de satin roșu, exact roșul pe care biletul îi spusese Fionei să-l agațe la coroniță, ca șantajistul să știe că banii așteptau sub trepte.</w:t>
       </w:r>
     </w:p>
     <w:p/>
@@ -1386,7 +1386,7 @@
     <w:p/>
     <w:p>
       <w:r>
-        <w:t>Magazinul Yarn Tales se afla la colțul străzilor Evergreen și Maple, cu vitrina plină de ghemuri înșirate după culoare ca o cutie de acuarele lăsată deschisă. Înăuntru era cald și o lumină difuză. Mirosea a lână și a mușețel pe care Olivia îl infuza mereu pe plita mică din spatele tejghelei. În după-amiaza aceea, cercul își trăsese scaunele aproape de intrare, în lumina apoasă de octombrie venită dinspre fereastră, și erau toate acolo. Olivia se afla în mijloc, bineînțeles, pentru că era prăvălia ei, mușețelul ei și, nu se știe cum, tot conversația ei; Dot lângă ea, zdravănă și cenușie, uscată ca un biscuite; Claire cu iuțeala ei de reporter, aflată deja cu trei rânduri înaintea tuturor; Ivy, care râdea de lucruri înainte ca ele să fie pe deplin comice; Martha, dreaptă în scaunul cel bun, cu gleznele încrucișate; și Ellie, blânda Ellie, încruntată deasupra unui ochi scăpat.</w:t>
+        <w:t xml:space="preserve">Magazinul Yarn Tales se afla la colțul străzilor Evergreen și Maple, cu vitrina plină de ghemuri înșirate după culoare ca o cutie de acuarele lăsată deschisă. Înăuntru era cald și lumina era difuză. Mirosea a lână și a mușețel pe care Olivia îl infuza mereu pe plita mică din spatele tejghelei. În după-amiaza aceea, cercul își trăsese scaunele aproape de intrare, în lumina apoasă de octombrie venită dinspre fereastră, și erau toate acolo. Olivia se afla în mijloc, bineînțeles, pentru că era prăvălia ei, mușețelul ei și, nu se știe cum, tot conversația ei; Dot lângă ea, zdravănă și cenușie, uscată ca un biscuite; Claire cu iuțeala ei de reporter, aflată deja cu trei rânduri înaintea tuturor; Ivy, care râdea de lucruri înainte ca ele să fie pe deplin comice; Martha, dreaptă în scaunul cel bun, cu gleznele încrucișate; și Ellie, blânda Ellie, încruntată deasupra unui ochi scăpat.</w:t>
       </w:r>
     </w:p>
     <w:p>
@@ -1486,12 +1486,12 @@
     </w:p>
     <w:p>
       <w:r>
-        <w:t>Îl bănuiam. Un om atât de disperat, care-și petrecuse nopțile singur printre cutiile lui Blackburn, care se ridicase în fața întregului oraș și spusese că cele mai interesante scrisori rătăciseră. Voiam să fiu sigură și m-am obligat să aștept.</w:t>
-      </w:r>
-    </w:p>
-    <w:p>
-      <w:r>
-        <w:t>Faptul că știi că secretul a venit din acte îți arată unde să stai, spusese Nick. Nu și cine. O mulțime de oameni din Frost Falls îi purtau de milă lui Theo. Jumătate din oraș ar fi plâns aflând cât de gravă era situația. Să-ți fie milă de un om, chiar și de cel mai disperat om din oraș, nu înseamnă același lucru cu a șantaja un prieten pentru bani, și n-am vrut să las una să se amestece cu cealaltă în mintea mea fără ceva mai mult decât niște calcule și o presimțire rea. Așa că am continuat să împletesc, mi-am ținut pumnul deschis și am lăsat suspiciunea să plutească ușor, ca un cărbune, gata să-l scap.</w:t>
+        <w:t xml:space="preserve">Îl bănuiam. Un om atât de disperat, care-și petrecuse nopțile singur printre cutiile familiei Blackburn, care se ridicase în fața întregului oraș și spusese că cele mai interesante scrisori se rătăciseră. Voiam să fiu sigură și m-am obligat să aștept.</w:t>
+      </w:r>
+    </w:p>
+    <w:p>
+      <w:r>
+        <w:t xml:space="preserve">Faptul că știi că secretul a venit din documente îți arată unde să stai, spusese Nick. Nu și cine. O mulțime de oameni din Frost Falls îi purtau de milă lui Theo. Jumătate din oraș ar fi plâns aflând cât de gravă era situația. Să-ți fie milă de un om, chiar și de cel mai disperat om din oraș, nu înseamnă același lucru cu a șantaja un prieten pentru bani, și n-am vrut să las una să se amestece cu cealaltă în mintea mea fără ceva mai mult decât niște calcule și o presimțire rea. Așa că am continuat să împletesc, mi-am ținut pumnul deschis și am lăsat suspiciunea să plutească ușor, ca un cărbune, gata să-l scap.</w:t>
       </w:r>
     </w:p>
     <w:p>
@@ -1575,7 +1575,7 @@
     </w:p>
     <w:p>
       <w:r>
-        <w:t>Dar trăisem multă vreme, iar dorințele nu schimbaseră niciodată ce era adevărat. Așa că am ținut dorința într-o mână și calculele reci în cealaltă. Îi voi spune lui Nick ce-mi spusese cercul și îmi voi ține pumnul deschis.</w:t>
+        <w:t xml:space="preserve">Dar trăisem multă vreme, iar dorințele nu schimbaseră niciodată ce era adevărat. Așa că am ținut dorința într-o mână și calculele reci în cealaltă. Aveam să-i spun lui Nick ce-mi spusese cercul și aveam să-mi țin pumnul deschis.</w:t>
       </w:r>
     </w:p>
     <w:p>
@@ -1816,7 +1816,7 @@
     </w:p>
     <w:p>
       <w:r>
-        <w:t>Am dus supa în salonul cel mic, ea a mâncat, iar eu am privit-o cum mănâncă. Învățasem de mult că poți spune multe despre starea în care se află o persoană după felul în care își amintește sau nu să-și guste mâncarea. Fiona încetase să-i mai simtă gustul, undeva în ultimele săptămâni. Mâncase prima jumătate din castron ca pe un medicament, repede și absentă. Apoi, pe la jumătatea lui, a încetinit și a gustat. Umerii i s-au lăsat cu un centimetru, și am știut că supa o ajuta.</w:t>
+        <w:t xml:space="preserve">Am dus supa în salonul cel mic, ea a mâncat, iar eu am privit-o cum mănâncă. Învățasem de mult că poți spune multe despre starea în care se află o persoană după felul în care își amintește sau nu să-și guste mâncarea. Fiona încetase să-i mai simtă gustul, undeva în ultimele săptămâni. A mâncat prima jumătate din castron ca pe un medicament, repede și absentă. Apoi, pe la jumătatea lui, a încetinit și a gustat. Umerii i s-au lăsat cu un centimetru, și am știut că supa o ajuta.</w:t>
       </w:r>
     </w:p>
     <w:p>
@@ -1876,7 +1876,7 @@
     </w:p>
     <w:p>
       <w:r>
-        <w:t>Asta i-a stârnit un râs adevărat, cel adânc care izbucnește dintr-odată, râsul care îmi lipsise, și mi-a făcut la fel de mult bine să-l aud pe cât îi făcuse și ei supa. Ne-am întors împreună la scaune. Eu număram în timp ce ea le repara pe cele șubrede, iar Pip superviza din petecul cald de soare. Timp de o oră, hanul a fost din nou doar un han, primitor și foșnitor, pregătindu-se pentru un festival. Orice altceva s-ar fi întâmplat, merita din plin să protejez asta: căldura pe care o fată speriată o făcuse din nimic și o lăsase moștenire o sută de ani mai târziu altei femei care număra scaune.</w:t>
+        <w:t xml:space="preserve">Asta i-a stârnit un râs adevărat, cel adânc care izbucnește dintr-odată, râsul care îmi lipsise, și mi-a făcut la fel de mult bine să-l aud pe cât îi făcuse și ei supa. Ne-am întors împreună la scaune. Eu număram în timp ce ea le repara pe cele șubrede, iar Pip superviza din petecul cald de soare. Timp de o oră, hanul a fost din nou doar un han, primitor și plin de forfotă, pregătindu-se pentru un festival. Orice altceva s-ar fi întâmplat, merita din plin să protejez asta: căldura pe care o fată speriată o făcuse din nimic și o lăsase moștenire o sută de ani mai târziu altei femei care număra scaune.</w:t>
       </w:r>
     </w:p>
     <w:p>
@@ -2027,7 +2027,7 @@
     </w:p>
     <w:p>
       <w:r>
-        <w:t>— De ce aș ști mai mult decât atât? Sunt fierar. Știu fierul și știu că-mi plătesc clienții cu întârziere. Familiile vechi și toate cele, ăsta e domeniul lui Theo, Societatea de Istorie. Praful mă face să strănut. N-am călcat niciodată pe-acolo.</w:t>
+        <w:t xml:space="preserve">— De ce aș ști mai mult decât atât? Sunt fierar. Știu fierul și știu că clienții mei plătesc cu întârziere. Familiile vechi și toate cele, ăsta e domeniul lui Theo, Societatea de Istorie. Praful mă face să strănut. N-am călcat niciodată pe-acolo.</w:t>
       </w:r>
     </w:p>
     <w:p/>
@@ -2444,7 +2444,7 @@
     </w:p>
     <w:p>
       <w:r>
-        <w:t>Atelierul strălucea pe la toate încheieturile. Asta a fost primul lucru, și m-a oprit pe cărare. Fiecare crăpătură din jurul ușii încuiate, fiecare gaură din vechii pereți de scândură lăsa să scape o lumină caldă și aurie, exact acel aur în care se transformaseră luminile de la festival, iar când mi-am pus palma pe ușă, lemnul acesteia era cald ca o pâine proaspătă. Dinăuntru venea fredonatul acela jos și fără melodie al lui Nick și, pe sub el, un sunet căruia nu-i știam numele. Un sunet ca al unui foc care se așază pentru noapte. Un sunet ca al unei arătări mari care respiră rar în somn.</w:t>
+        <w:t xml:space="preserve">Atelierul strălucea pe la toate încheieturile. Asta a fost primul lucru, și m-a oprit pe cărare. Fiecare crăpătură din jurul ușii încuiate, fiecare gaură din vechii pereți de scândură lăsa să scape o lumină caldă și aurie, exact acel aur în care se transformaseră luminile de la festival, iar când mi-am pus palma pe ușă, lemnul acesteia era cald ca o pâine proaspătă. Dinăuntru venea fredonatul acela jos și fără melodie al lui Nick și, pe sub el, un sunet căruia nu-i știam numele. Un sunet ca al unui foc care se așază pentru noapte. Un sunet ca al unui lucru mare care respiră rar în somn.</w:t>
       </w:r>
     </w:p>
     <w:p>
@@ -2524,7 +2524,7 @@
     </w:p>
     <w:p>
       <w:r>
-        <w:t>Luminile au ars în nuanțe aurii deasupra Frost Falls, iar dincolo de țarc soțul meu construia un cămin pentru o magie fără adăpost. Am mai zăbovit o clipă în bucătăria mea caldă, cu greutatea vieții mele lungi așezată pe umeri. Apoi m-am întors la treabă.</w:t>
+        <w:t xml:space="preserve">Luminile ardeau în nuanțe aurii deasupra Frost Falls, iar dincolo de țarc soțul meu construia un cămin pentru o magie fără adăpost. Am mai zăbovit o clipă în bucătăria mea caldă, cu greutatea vieții mele lungi așezată pe umeri. Apoi m-am întors la treabă.</w:t>
       </w:r>
     </w:p>
     <w:p>
@@ -2547,7 +2547,7 @@
     <w:p/>
     <w:p>
       <w:r>
-        <w:t>Vera ședea la biroul de afară, ea fiind cea care punea totul în mișcare pe-acolo. Toată lumea o știa, dar nimeni n-o spunea. Ea ținea fișierele și cheile. Primarul avea nasul și strângerea de mână. A ridicat privirea când am intrat, iar zâmbetul pe care l-a găsit a fost protocolar și obosit.</w:t>
+        <w:t xml:space="preserve">Vera ședea la biroul de afară, ea fiind cea care punea totul în mișcare pe-acolo. Toată lumea o știa, dar nimeni n-o spunea. Ea ținea dosarele și cheile. Primarul avea nasul și strângerea de mână. A ridicat privirea când am intrat, iar zâmbetul pe care l-a găsit a fost protocolar și obosit.</w:t>
       </w:r>
     </w:p>
     <w:p/>
@@ -2802,7 +2802,7 @@
     </w:p>
     <w:p>
       <w:r>
-        <w:t>Consiliul a discutat în cercuri timp de o oră, propunând vânzări de prăjituri și o campanie de scrisori, fiecare idee fiind mai mică decât gaura pe care trebuia s-o umple. Toată sala știa asta și totuși a rostit acele lucruri pline de speranță, fiindcă a tăcea era și mai rău. În cele din urmă, au votat să țină ușile deschise prin noul an și să „exploreze toate opțiunile”. S-au ridicat și au ieșit în frig. Vasul cu cafea a fâsâit și a amuțit, iar Theo a rămas în urmă ca să strângă singur scaunele pliante.</w:t>
+        <w:t xml:space="preserve">Consiliul a discutat în cercuri timp de o oră, propunând vânzări de prăjituri și o campanie de scrisori, fiecare idee fiind mai mică decât gaura pe care trebuia s-o umple. Toată sala știa asta și totuși a rostit acele lucruri pline de speranță, fiindcă a tăcea era și mai rău. În cele din urmă, au votat să țină ușile deschise până după Anul Nou și să „exploreze toate opțiunile”. S-au ridicat și au ieșit în frig. Vasul cu cafea a fâsâit și a amuțit, iar Theo a rămas în urmă ca să strângă singur scaunele pliante.</w:t>
       </w:r>
     </w:p>
     <w:p>
@@ -2864,7 +2864,7 @@
     <w:p/>
     <w:p>
       <w:r>
-        <w:t>— Extinderea, am spus, făcând din cap spre peretele din spate, unde o deschizătură pentru ușă fusese încadrată în montanți groși de lemn și lăsată așa, cu golul acoperit de o folie de plastic care se umfla și se dezumfla ușor în curent. Cum înaintează?</w:t>
+        <w:t xml:space="preserve">— Extinderea, am spus, făcând din cap spre peretele din spate, unde o deschizătură pentru ușă fusese încadrată în montanți groși de lemn și lăsată așa, cu golul acoperit de o folie de plastic care se umfla și se dezumfla ușor în curent. — Cum înaintează?</w:t>
       </w:r>
     </w:p>
     <w:p/>
@@ -2888,7 +2888,7 @@
     <w:p/>
     <w:p>
       <w:r>
-        <w:t>— Așa e. — A dat afară un oftat prelung și apoi, pentru că mama lui îl crescuse probabil să nu se plângă fără să aibă un plan pregătit, și-a îndreptat umerii. — Dar iată ce fac în privința asta, din moment ce ați întrebat, și prefer să vă spun direct decât să vă faceți griji. Am luat contractul de pază pentru festival. Peste noapte, tot weekendul, supraveghind standurile, scena și echipamentul ca să nu dispară nimic în întuneric. Și am adăugat orele matinale, antrenamentul de la cinci și jumătate, înainte ca ziua obișnuită măcar să înceapă. A ridicat din umeri, iar rânjetul a revenit mai sincer de data aceasta. — Nu rezolvi problemele cu bani dorindu-ți lucruri, doamnă Claus. Le rezolvi muncind mai multe ore decât are necazul. Este singura metodă pe care o cunosc și nu m-a dezamăgit niciodată până acum, e doar lentă și doare.</w:t>
+        <w:t xml:space="preserve">— Așa e. — A dat afară un oftat prelung și apoi, pentru că mama lui îl crescuse probabil să nu se plângă fără să aibă un plan pregătit, și-a îndreptat umerii. — Dar iată ce fac în privința asta, din moment ce ați întrebat, și prefer să vă spun direct decât să vă faceți griji. Am luat contractul de pază pentru festival. Peste noapte, tot weekendul, supraveghind standurile, scena și echipamentul ca să nu dispară nimic în întuneric. Și am adăugat orele matinale, antrenamentul de la cinci și jumătate, înainte ca ziua obișnuită măcar să înceapă. — A ridicat din umeri, iar rânjetul a revenit mai sincer de data aceasta. — Nu rezolvi problemele cu bani dorindu-ți lucruri, doamnă Claus. Le rezolvi muncind mai multe ore decât are necazul. Este singura metodă pe care o cunosc și nu m-a dezamăgit niciodată până acum, e doar lentă și doare.</w:t>
       </w:r>
     </w:p>
     <w:p/>
@@ -2906,7 +2906,7 @@
     <w:p/>
     <w:p>
       <w:r>
-        <w:t>— L-ați ajutat pe Theo cu expoziția, am spus. Toate actele acelea vechi. Ați aruncat o privire peste vreunul în timp ce erați acolo? Lucrurile familiei Blackburn, scrisorile vechi?</w:t>
+        <w:t xml:space="preserve">— L-ați ajutat pe Theo cu expoziția, am spus. Toate documentele acelea vechi. Ați aruncat o privire peste vreunul în timp ce erați acolo? Lucrurile familiei Blackburn, scrisorile vechi?</w:t>
       </w:r>
     </w:p>
     <w:p/>
@@ -2918,7 +2918,7 @@
     <w:p/>
     <w:p>
       <w:r>
-        <w:t>A spus-o cu lejeritate, fără să-și dea seama că îmi dăduse ceva, iar eu mi-am păstrat chipul relaxat în timp ce înăuntrul meu se auzea acel clic mic și curat. Nu citise scrisorile. Cărase cutiile cu privirea pironită la picioare. Indiferent ce citise șantajistul în actele familiei Blackburn, broșa, piatra, casa de amanet, Jamal nu le avusese niciodată în fața ochilor. Le avusese în brațe, închise într-o cutie, și nu se uitase niciodată înăuntru.</w:t>
+        <w:t xml:space="preserve">A spus-o cu lejeritate, fără să-și dea seama că îmi dăduse ceva, iar eu mi-am păstrat chipul relaxat în timp ce înăuntrul meu se auzea acel clic mic și curat. Nu citise scrisorile. Cărase cutiile cu privirea pironită la picioare. Indiferent ce citise șantajistul în documentele familiei Blackburn, broșa, piatra, casa de amanet, Jamal nu le avusese niciodată în fața ochilor. Le avusese în brațe, închise într-o cutie, și nu se uitase niciodată înăuntru.</w:t>
       </w:r>
     </w:p>
     <w:p/>
@@ -2948,7 +2948,7 @@
     <w:p/>
     <w:p>
       <w:r>
-        <w:t>Era curat. Certitudinea acestui lucru s-a așezat curat în mine și a făcut două lucruri în același timp. M-a liniștit, pentru că îl plăcusem pe Jamal și nu-mi dorisem să fie el.</w:t>
+        <w:t xml:space="preserve">Era nevinovat. Certitudinea acestui lucru s-a așezat curat în mine și a făcut două lucruri în același timp. M-a liniștit, pentru că îl plăcusem pe Jamal și nu-mi dorisem să fie el.</w:t>
       </w:r>
     </w:p>
     <w:p/>
@@ -3343,7 +3343,7 @@
     </w:p>
     <w:p>
       <w:r>
-        <w:t>— Hanul e plin pentru festival, am spus eu. E alergată de sus până jos.</w:t>
+        <w:t xml:space="preserve">— Hanul e plin pentru festival, am spus eu. E ocupată până peste cap.</w:t>
       </w:r>
     </w:p>
     <w:p>
@@ -3395,7 +3395,7 @@
     </w:p>
     <w:p>
       <w:r>
-        <w:t>— Începe cu cele ușoare, a spus Nick, așezându-se vizavi de mine cu ceașca lui, suflând în aburul care se ridica din ea. Vorbește cu voce tare despre ele. Gândești mai limpede așa și ai făcut-o întotdeauna, orice le-ai spune oamenilor despre marea ta minte liniștită.</w:t>
+        <w:t xml:space="preserve">— Începe cu cele ușoare, a spus Nick, așezându-se vizavi de mine cu ceașca lui, suflând în aburul care se ridica din ea. Vorbește cu voce tare despre ele. Gândești mai limpede așa și întotdeauna a fost așa, orice le-ai spune oamenilor despre marea ta minte liniștită.</w:t>
       </w:r>
     </w:p>
     <w:p>
@@ -3405,7 +3405,7 @@
     </w:p>
     <w:p>
       <w:r>
-        <w:t>— Jamal a cărat cutiile, dar n-a deschis niciuna, am spus. Mi-a spus-o chiar el, și-l cred. Întreaga lui bursă de istorie s-a bazat pe „ai grijă, e prețios”. A pus mâna pe exteriorul secretului toată săptămâna și nu s-a uitat niciodată înăuntru. Și omul ăsta muncește la trei locuri de muncă ca să iasă din groapă pe căi cinstite, și antrenamentul de la cinci și jumătate dimineața, și paza de noapte. Nu e el. — Am tras o linie fermă peste numele lui Jamal. — A avut ocazia, dar n-a știut. Și nici n-ar avea inima pentru așa ceva, ceea ce contează pentru mine, chiar dacă n-ar ține în fața unei instanțe.</w:t>
+        <w:t xml:space="preserve">— Jamal a cărat cutiile, dar n-a deschis niciuna, am spus. Mi-a spus-o chiar el, și-l cred. Toată știința lui de istoric s-a rezumat la „ai grijă, e prețios”. A pus mâna pe exteriorul secretului toată săptămâna și nu s-a uitat niciodată înăuntru. Și omul ăsta muncește la trei locuri de muncă ca să iasă din groapă pe căi cinstite, și antrenamentul de la cinci și jumătate dimineața, și paza de noapte. Nu e el. — Am tras o linie fermă peste numele lui Jamal. — A avut ocazia, dar n-a știut. Și nici n-ar avea inima pentru așa ceva, ceea ce contează pentru mine, chiar dacă n-ar ține în fața unei instanțe.</w:t>
       </w:r>
     </w:p>
     <w:p>
@@ -3450,7 +3450,7 @@
     </w:p>
     <w:p>
       <w:r>
-        <w:t>— Au rămas doi. — M-am uitat la pagină și nu voiam s-o fac. Vera. Theo. Cele două nume peste care n-aveam cum să trag nicio linie. — Și asta mă îngrijorează. Dintre toți de pe pagina asta, singurii doi pe care nu-i pot scoate din cauză sunt cei doi care țin cheile vechilor documente ale orașului. Vera păstrează actele și registrele de proprietate, un secol de cine-a-deținut-ce, actul hanului aflându-se undeva printre ele. S-a încordat ca o scândură și mi-a spus că nu citește niciodată actele care stau chiar în spatele ei. Și Theo. — M-am obligat să o spun rar. — Theo locuiește în arhivă. Scrisorile lui Blackburn au fost în grija lui, în mâinile lui. Iar cele mai interesante dintre ele, chiar cele care ar spune că o broșă a dispărut și unde a ajuns, sunt cele despre care el s-a ridicat în fața întregului oraș și a anunțat că s-au rătăcit.</w:t>
+        <w:t xml:space="preserve">— Au rămas doi. — M-am uitat la pagină și nu voiam s-o fac. Vera. Theo. Cele două nume peste care n-aveam cum să trag nicio linie. — Și asta mă îngrijorează. Dintre toți de pe pagina asta, singurii doi pe care nu-i pot scoate din cauză sunt cei doi care țin cheile vechilor documente ale orașului. Vera păstrează actele și registrele de proprietate, un secol de cine-a-deținut-ce, actul hanului aflându-se undeva printre ele. S-a încordat ca o scândură și mi-a spus că nu citește niciodată actele care stau chiar în spatele ei. Și Theo. — M-am obligat să o spun rar. — Theo locuiește în arhivă. Scrisorile familiei Blackburn au fost în grija lui, în mâinile lui. Iar cele mai interesante dintre ele, chiar cele care ar spune că o broșă a dispărut și unde a ajuns, sunt cele despre care el s-a ridicat în fața întregului oraș și a anunțat că s-au rătăcit.</w:t>
       </w:r>
     </w:p>
     <w:p>
@@ -3465,12 +3465,12 @@
     </w:p>
     <w:p>
       <w:r>
-        <w:t>— Nu vreau să fie nimeni. — Mi-am pus palmele pe masă de o parte și de alta a paginii. — Vreau să fi înțeles totul greșit. Vreau ca Neil să se dovedească a fi un ticălos abil, ca să fie un străin care a nimerit prin oraș, și nu un prieten care locuiește aici de treizeci de ani. Dar dorința nu e o dovadă, Nick, n-a fost niciodată, iar fiecare faptă pe care o scot la iveală construiește aceeași formă, iar forma asta îl are pe Theo în mijloc. Scrisorile au ieșit din arhivă. Biletul e scris pe hârtia proprie a arhivei. Iar omul care conduce arhiva e disperat. A bătut la fiecare ușă cinstită care există și le-a găsit pe toate închise în nas. — Am clătinat din cap. — E o formă îngrozitoare. Sper mereu că următorul fapt o va deschide. Iar următorul fapt nu face decât să pună încă o piatră în ea.</w:t>
-      </w:r>
-    </w:p>
-    <w:p>
-      <w:r>
-        <w:t xml:space="preserve">— Atunci testează-o, a spus Nick, în loc să stai aici în bucătărie făcându-ți griji, ceea ce n-a rezolvat nimic și n-o va face niciodată. Du-te și uită-te la singurul lucru la care nu te-ai uitat cum trebuie încă. Scrisorile în sine, sau locul în care ar trebui să fie. — S-a întins peste masă și și-a pus mâna caldă peste a mea, care era rece. — Theo ar avea nevoie de o pereche de mâini ca să pună arhiva aceea în ordine. Du-te și oferă-ți ajutorul. Și în timp ce ajuți, află un singur lucru. Dacă cuvintele din biletul ăla se potrivesc cu cuvintele din scrisorile care au dispărut. Pentru că dacă o fac, Jess, atunci oricine a scris biletul n-a citit doar actele lui Blackburn în general. A avut acele scrisori exacte în mâini. Și este o listă foarte scurtă de oameni în </w:t>
+        <w:t xml:space="preserve">— Nu vreau să fie nimeni. — Mi-am pus palmele pe masă de o parte și de alta a paginii. — Vreau să fi înțeles totul greșit. Vreau ca Neil să se dovedească a fi un ticălos abil, ca să fie un străin care a nimerit prin oraș, și nu un prieten care locuiește aici de treizeci de ani. Dar dorința nu e o dovadă, Nick, n-a fost niciodată, iar fiecare fapt pe care îl scot la iveală construiește aceeași formă, iar forma asta îl are pe Theo în mijloc. Scrisorile au ieșit din arhivă. Biletul e scris pe hârtia proprie a arhivei. Iar omul care conduce arhiva e disperat. A bătut la fiecare ușă cinstită care există și le-a găsit pe toate închise în nas. — Am clătinat din cap. — E o formă îngrozitoare. Sper mereu că următorul fapt o va deschide. Iar următorul fapt nu face decât să pună încă o piatră în ea.</w:t>
+      </w:r>
+    </w:p>
+    <w:p>
+      <w:r>
+        <w:t xml:space="preserve">— Atunci testează-o, a spus Nick, în loc să stai aici în bucătărie făcându-ți griji, ceea ce n-a rezolvat nimic și n-o va face niciodată. Du-te și uită-te la singurul lucru la care nu te-ai uitat cum trebuie încă. Scrisorile în sine, sau locul în care ar trebui să fie. — S-a întins peste masă și și-a pus mâna caldă peste a mea, care era rece. — Theo ar avea nevoie de o pereche de mâini ca să pună arhiva aceea în ordine. Du-te și oferă-ți ajutorul. Și în timp ce ajuți, află un singur lucru. Dacă cuvintele din biletul ăla se potrivesc cu cuvintele din scrisorile care au dispărut. Pentru că dacă o fac, Jess, atunci oricine a scris biletul n-a citit doar documentele familiei Blackburn în general. A avut acele scrisori exacte în mâini. Și este o listă foarte scurtă de oameni în </w:t>
       </w:r>
       <w:r/>
       <w:r>
@@ -3488,7 +3488,7 @@
     </w:p>
     <w:p>
       <w:r>
-        <w:t>— În curând, am spus. Mai sunt două fire de încheiat înainte. Sam și străinul. Vreau să dispară amândoi cu certitudine, curățați de orice urmă de îndoială, înainte să mă las să intru în arhiva aceea și să mă uit atent la Theo. Îi datorez măcar atât, să nu mă pripesc asupra lui până când nu mai rămâne nimeni altcineva de bănuit. Și pe urmă o să mă duc, o să mă uit la scrisori și o să aflu dacă cuvintele se potrivesc.</w:t>
+        <w:t xml:space="preserve">— În curând, am spus. Mai sunt două fire de încheiat înainte. Sam și străinul. Vreau să-i scot pe amândoi de pe listă cu certitudine, dincolo de orice îndoială, înainte să mă las să intru în arhiva aceea și să mă uit atent la Theo. Îi datorez măcar atât, să nu mă pripesc asupra lui până când nu mai rămâne nimeni altcineva de bănuit. Și pe urmă o să mă duc, o să mă uit la scrisori și o să aflu dacă cuvintele se potrivesc.</w:t>
       </w:r>
     </w:p>
     <w:p>
@@ -3515,7 +3515,7 @@
     <w:p/>
     <w:p>
       <w:r>
-        <w:t>Nu era la forjă. Era la han, urcat pe o scară pe pridvor și prindea ultimele console de fier, cu un pumn de șuruburi în gură și cu o nivelă echilibrată pe balustradă. A coborât când m-a văzut pe cărare, suspicios. Ultima oară când vorbisem, îl tot ocolisem cu întrebări fără să spun direct ce am pe minte, iar el simțise asta, chiar dacă n-ar fi putut să o pună în cuvinte.</w:t>
+        <w:t xml:space="preserve">Nu era la forjă. Era la han, urcat pe o scară pe pridvor și prindea ultimele console de fier, cu gura plină de șuruburi și cu o nivelă echilibrată pe balustradă. A coborât când m-a văzut pe cărare, suspicios. Ultima oară când vorbisem, îl tot ocolisem cu întrebări fără să spun direct ce aveam pe minte, iar el simțise asta, chiar dacă n-ar fi putut să o pună în cuvinte.</w:t>
       </w:r>
     </w:p>
     <w:p/>
@@ -3575,7 +3575,7 @@
     <w:p/>
     <w:p>
       <w:r>
-        <w:t>Mirosul de pe bilet nu fusese niciodată al lui Sam. Era aroma muncii lui. Un fierar finisează fierul arzând ulei în el cât încă e încins, iar piesele noi de fierar poartă mirosul acela de fum săptămâni întregi. Holul Fionei era plin de el, balustrada scării, paravanul de la șemineu, consolele montate pe pridvor, iar haina lui Sam și geanta cu scule atârnaseră lângă ușa ei în fiecare zi timp de trei săptămâni. Fiecare hârtie care stătea pe biroul acela prelua mirosul. Biletul zăcuse și el acolo. Indiciul care îl pusese în capul listei mele îmi spusese de la bun început unde fusese biletul. Nu cine îl scrisese. Îl citisem de-a îndărătelele. Acum puteam să-l citesc cum trebuie, iar lectura corectă îl achita complet și curat.</w:t>
+        <w:t xml:space="preserve">Mirosul de pe bilet nu fusese niciodată al lui Sam. Era aroma muncii lui. Un fierar finisează fierul arzând ulei în el cât încă e încins, iar piesele noi de fierărie poartă mirosul acela de fum săptămâni întregi. Holul Fionei era plin de el, balustrada scării, paravanul de la șemineu, consolele montate pe pridvor, iar haina lui Sam și geanta cu scule atârnaseră lângă ușa ei în fiecare zi timp de trei săptămâni. Fiecare hârtie care stătea pe biroul acela prelua mirosul. Biletul zăcuse și el acolo. Indiciul care îl pusese în capul listei mele îmi spusese de la bun început unde fusese biletul. Nu cine îl scrisese. Îl citisem de-a îndărătelele. Acum puteam să-l citesc cum trebuie, iar lectura corectă îl achita complet și curat.</w:t>
       </w:r>
     </w:p>
     <w:p/>
@@ -3700,7 +3700,7 @@
     <w:p/>
     <w:p>
       <w:r>
-        <w:t>Am stat cu dosarul deschis în mâini și ceva s-a răsucit încet în interiorul pieptului meu. Asta schimba forma întregului lucru. Secretul pe care Fiona se chinuise până la epuizare să-l păstreze, rușinosul furt din rădăcinile familiei ei, arăta diferit când întindeai actele la lumină. Era o poveste dură și una omenească: o fată disperată într-o casă rece și o datorie achitată în singurul mod care îi mai rămăsese la îndemână. Spusă într-un fel, în șoaptă, cu jumătate din fapte, o putea distruge. Spusă în felul adevărat, pe de-a-ntregul, cu documentele lui Neil întinse sub ea, s-ar putea să n-o distrugă deloc. S-ar putea chiar să fie o poveste în interiorul căreia o femeie să poată sta dreaptă.</w:t>
+        <w:t xml:space="preserve">Am stat cu dosarul deschis în mâini și ceva s-a răsucit încet în interiorul pieptului meu. Asta schimba forma întregului lucru. Secretul pe care Fiona se chinuise până la epuizare să-l păstreze, rușinosul furt din rădăcinile familiei ei, arăta diferit când întindeai documentele la lumină. Era o poveste dură și una omenească: o fată disperată într-o casă rece și o datorie achitată în singurul mod care îi mai rămăsese la îndemână. Spusă într-un fel, în șoaptă, cu jumătate din fapte, o putea distruge. Spusă în felul adevărat, pe de-a-ntregul, cu documentele lui Neil întinse sub ea, s-ar putea să n-o distrugă deloc. S-ar putea chiar să fie o poveste în interiorul căreia o femeie să poată sta dreaptă.</w:t>
       </w:r>
     </w:p>
     <w:p/>
@@ -3712,7 +3712,7 @@
     <w:p/>
     <w:p>
       <w:r>
-        <w:t>— Păstrați-l. Am copii după fiecare pagină. — S-a oprit și, pentru o dată, luminozitatea din el s-a domolit și a devenit blândă. — Spuneți-i ceva prietenei dumneavoastră, din partea unui om care citește corespondența unor oameni morți pentru a-și câștiga existența. Secretele care îi distrug pe oameni sunt cele povestite pe jumătate. De fiecare dată. Ascunzișul le dă colți, nu adevărul. Am dezgropat o sută de secrete de familie în cariera mea, și fiecare în parte s-a dovedit a fi mai mic și mai trist decât se temuse familia să fie toată viața.</w:t>
+        <w:t xml:space="preserve">— Păstrați-l. Am copii după fiecare pagină. — S-a oprit și, pentru o dată, luminozitatea din el s-a domolit și a devenit blândă. — Spuneți-i ceva prietenei dumneavoastră, din partea unui om care citește corespondența unor oameni morți pentru a-și câștiga existența. Secretele care îi distrug pe oameni sunt cele povestite pe jumătate. De fiecare dată. Ascunderea le dă colți, nu adevărul. Am dezgropat o sută de secrete de familie în cariera mea, și fiecare în parte s-a dovedit a fi mai mic și mai trist decât se temuse familia să fie toată viața.</w:t>
       </w:r>
     </w:p>
     <w:p/>
@@ -3883,7 +3883,7 @@
     <w:p/>
     <w:p>
       <w:r>
-        <w:t>— În același mod în care face oricine un lucru groaznic, a spus Nick. Spunându-și că o face pentru ceva bun, și repetându-și asta din nou și din nou, până când nu mai vede altceva decât binele despre care tot își vorbește, în timp ce răul devine mic și se îndepărtează la marginea câmpului vizual. Iubirea este cea care îi permite asta, Jess. Asta este partea cea mai crudă. Theo n-ar fura niciodată un ban pentru sine. Pentru Societate, s-a lăsat convins de aproape orice.</w:t>
+        <w:t xml:space="preserve">— În același mod în care face oricine un lucru groaznic, a spus Nick. Spunându-și că o face pentru ceva bun, și repetându-și asta din nou și din nou, până când nu mai vede altceva decât binele despre care tot își vorbește, în timp ce răul devine mic și se îndepărtează la marginea câmpului vizual. Iubirea este cea care îi permite asta, Jess. Asta este partea cea mai crudă. Theo n-ar fura niciodată un ban pentru sine. Pentru Societate, s-a convins singur să facă aproape orice.</w:t>
       </w:r>
     </w:p>
     <w:p/>
@@ -3931,13 +3931,13 @@
     <w:p/>
     <w:p>
       <w:r>
-        <w:t>— O vatră, am spus, abia șoptit.</w:t>
-      </w:r>
-    </w:p>
-    <w:p/>
-    <w:p>
-      <w:r>
-        <w:t>— O vatră. — Brațul lui m-a cuprins. — Nu e gata. Încă nu poate s-o țină, nu pe toată, nu definitiv. Acolo e vorba de ani de muncă, Jess. Dar e un început. Un loc unde să vină. Așa că o să se oprească din rătăcit prin întuneric. — S-a uitat în jos la mine, cu lumina aurie jucându-i-se pe chip. — Am vrut să vezi asta în seara asta pentru că porți cu tine un lucru groaznic și n-am vrut să umbli prin lume gândindu-te că tot restul e alcătuit doar din oameni care fac rău în întuneric. Unii dintre noi sunt și ei pe aici, prin întuneric, construind locuri unde căldura să poată poposi.</w:t>
+        <w:t xml:space="preserve">— Un cămin, am spus, abia șoptit.</w:t>
+      </w:r>
+    </w:p>
+    <w:p/>
+    <w:p>
+      <w:r>
+        <w:t xml:space="preserve">— Un cămin. — Brațul lui m-a cuprins. — Nu e gata. Încă nu poate s-o țină, nu pe toată, nu definitiv. Acolo e vorba de ani de muncă, Jess. Dar e un început. Un loc unde să vină. Ca să nu mai rătăcească prin întuneric. — S-a uitat în jos la mine, cu lumina aurie jucându-i-se pe chip. — Am vrut să vezi asta în seara asta pentru că porți cu tine un lucru groaznic și n-am vrut să umbli prin lume gândindu-te că tot restul e alcătuit doar din oameni care fac rău în întuneric. Unii dintre noi sunt și ei pe aici, prin întuneric, construind locuri unde căldura să poată poposi.</w:t>
       </w:r>
     </w:p>
     <w:p/>
@@ -4014,7 +4014,7 @@
     <w:p/>
     <w:p>
       <w:r>
-        <w:t xml:space="preserve">L-am luat din mâna ei. Aceeași hârtie crem. Același scris frânt în mod deliberat. Mai scurt decât primul acesta, și cu atât mai crud prin această scurtime. </w:t>
+        <w:t xml:space="preserve">L-am luat din mâna ei. Aceeași hârtie crem. Același scris frânt în mod deliberat. Acesta era mai scurt decât primul, și cu atât mai crud prin această scurtime. </w:t>
       </w:r>
       <w:r>
         <w:rPr>
@@ -4032,7 +4032,7 @@
     <w:p/>
     <w:p>
       <w:r>
-        <w:t>— Duminică, a spus Fiona. Asta înseamnă trei zile. N-am banii în trei zile, n-am banii în trei ani, și trebuie să știe asta, pur și simplu trebuie, așa că ce naiba mai vrea de la mine? Vrea doar să se vadă cum mă duc la fund?</w:t>
+        <w:t xml:space="preserve">— Duminică, a spus Fiona. Asta înseamnă trei zile. N-am banii în trei zile, n-am banii în trei ani, și trebuie să știe asta, pur și simplu trebuie, așa că ce naiba mai vrea de la mine? Vrea doar să vadă cum mă duc la fund?</w:t>
       </w:r>
     </w:p>
     <w:p/>
@@ -4086,13 +4086,13 @@
     <w:p/>
     <w:p>
       <w:r>
-        <w:t>Dar venisem pentru mai mult decât pentru niște vorbe bune. Am întors biletul pe dos și m-am uitat, de data aceasta, nu la cuvintele acelea crude, ci la hârtie. De culoarea smântânii. Puțin grea între degete. Liniile acelea fine imprimate în fibră, subtile și paralele, pe care le observi doar când ții ceva în bătaia luminii. Exact ca primul bilet și ca teancul pe care îl văzusem pe un birou de lângă ușa Societății de Istorie în dimineața deschiderii expoziției. Al doilea bilet n-a făcut decât să confirme acest lucru. Șantajistul scria în continuare ce spuneau scrisorile lui Blackburn pe hârtia Societății.</w:t>
-      </w:r>
-    </w:p>
-    <w:p/>
-    <w:p>
-      <w:r>
-        <w:t>Asta lămurea locul în mod indiscutabil și aproape că-l arăta și pe cel vinovat. Îmi lăsase în suflet o greutate rece, fiindcă știam deja, după ce am văzut arhiva, prin ce mâini trecuseră acele scrisori. Dar, stând acolo în camera aceea friguroasă, am dat peste un amănunt care nu se potrivea deloc și care nu voia nicicum să se așeze, oricum l-aș fi întors.</w:t>
+        <w:t xml:space="preserve">Dar venisem pentru mai mult decât pentru niște vorbe bune. Am întors biletul pe dos și m-am uitat, de data aceasta, nu la cuvintele acelea crude, ci la hârtie. De culoarea smântânii. Puțin grea între degete. Liniile acelea fine imprimate în fibră, subtile și paralele, pe care le observi doar când ții ceva în bătaia luminii. Exact ca primul bilet și ca teancul pe care îl văzusem pe un birou de lângă ușa Societății de Istorie în dimineața deschiderii expoziției. Al doilea bilet n-a făcut decât să confirme acest lucru. Șantajistul scria în continuare ce spuneau scrisorile familiei Blackburn pe hârtia Societății.</w:t>
+      </w:r>
+    </w:p>
+    <w:p/>
+    <w:p>
+      <w:r>
+        <w:t xml:space="preserve">Asta lămurea locul în mod indiscutabil și aproape că-l arăta și pe cel vinovat. Îmi lăsase în suflet o greutate rece, fiindcă știam deja, după ce văzusem arhiva, prin ce mâini trecuseră acele scrisori. Dar, stând acolo în camera aceea friguroasă, am dat peste un amănunt care nu se potrivea deloc și care nu voia nicicum să se așeze, oricum l-aș fi întors.</w:t>
       </w:r>
     </w:p>
     <w:p/>
@@ -4107,7 +4107,7 @@
         <w:t xml:space="preserve">A intrat în holul meu. A stat chiar la biroul meu. L-a pus printre scrisorile mele și a plecat, iar eu nu l-am văzut.</w:t>
       </w:r>
       <w:r>
-        <w:t xml:space="preserve"> Am încercat să mi-l închipui pe omul despre care credeam acum că îl scrisese intrând în acea scenă, am încercat să-l văd traversând holul plin de lume în plină zi, lăsând un plic pe recepție și plimbându-se nestingherit afară. Și n-am putut face ca imaginea să se lege. Nu pentru el. Era prea cunoscut în orașul acesta, prea urmărit, oprit la fiecare colț de stradă. N-ar fi putut traversa o încăpere în Frost Falls fără ca patru oameni să nu-l apuce de mânecă pentru a se contrazice pe tema fondării bisericii. N-ar fi putut face un gest invizibil într-o încăpere plină.</w:t>
+        <w:t xml:space="preserve"> Am încercat să mi-l închipui pe omul despre care credeam acum că îl scrisese intrând în acea scenă, am încercat să-l văd traversând holul plin de lume în plină zi, lăsând un plic pe recepție și plimbându-se nestingherit afară. Și n-am putut face ca imaginea să se lege. Nu pentru el. Era prea cunoscut în orașul acesta, prea urmărit, oprit la fiecare colț de stradă. N-ar fi putut traversa o încăpere în Frost Falls fără ca patru oameni să-l apuce de mânecă pentru a se contrazice pe tema fondării bisericii. N-ar fi putut face un gest invizibil într-o încăpere plină.</w:t>
       </w:r>
     </w:p>
     <w:p/>
@@ -4125,7 +4125,7 @@
     <w:p/>
     <w:p>
       <w:r>
-        <w:t>— Trei zile, am încuviințat și am pus biletul lângă primul. Și o să rezolv totul înainte ca ultimul dintre ei să plece. Îți promit asta.</w:t>
+        <w:t xml:space="preserve">— Trei zile, am încuviințat și am pus biletul lângă primul. Și o să rezolv totul înainte să treacă ultima dintre ele. Îți promit asta.</w:t>
       </w:r>
     </w:p>
     <w:p/>
@@ -4291,7 +4291,7 @@
       </w:r>
       <w:r/>
       <w:r>
-        <w:t xml:space="preserve"> exprimarea unui istoric, nu a unui hoț, aflate în biletul de șantaj exact la fel ca pe fișa scrisă cu mâna îngrijită și aplecată a lui Theo. Biletul fusese scris pe hârtia cu antet de culoare crem a Societății, hârtia aceea groasă și vergată pe care o văzusem stivuită pe tejghea la intrarea în expoziție. Omul care conducea arhiva se scufunda. Bătuse la orice ușă cinstită din trei state și văzuse cum se închid toate. Se ridicase în fața întregului oraș și anunțase, cu părere de rău, că tocmai scrisorile în care era descrisă broșa rătăciseră calea.</w:t>
+        <w:t xml:space="preserve"> exprimarea unui istoric, nu a unui hoț, aflate în biletul de șantaj exact la fel ca pe fișa scrisă cu mâna îngrijită și aplecată a lui Theo. Biletul fusese scris pe hârtia de corespondență de culoare crem a Societății, hârtia aceea groasă și vergată pe care o văzusem stivuită pe tejghea la intrarea în expoziție. Omul care conducea arhiva se scufunda. Bătuse la orice ușă cinstită din trei state și văzuse cum se închid toate. Se ridicase în fața întregului oraș și anunțase, cu părere de rău, că tocmai scrisorile în care era descrisă broșa rătăciseră calea.</w:t>
       </w:r>
     </w:p>
     <w:p>
@@ -4301,7 +4301,7 @@
     </w:p>
     <w:p>
       <w:r>
-        <w:t>Am luat cel de-al doilea bilet și o foaie cu antetul Societății, una goală pe care mi-o dăduse Theo la arhivă ca să scriu etichete noi pentru dosare, pe care o adusesem acasă în geantă. Le-am ținut pe amândouă în dreptul lămpii, una lângă alta. Același crem. Aceeași greutate între degete. Aceleași dungi vergate vag presate în textură, acele riduri paralele fine pe care sita fabricantului de hârtie le lasă în urmă, ușor de văzut dacă știi să ții o foaie la lumină și să te uiți. Se potriveau. Bineînțeles că se potriveau. Biletul fusese scris pe hârtie luată din stocul lui Theo, teancul de pe tejgheaua clădirii pe care nu o părăsise de zile întregi.</w:t>
+        <w:t xml:space="preserve">Am luat cel de-al doilea bilet și o foaie din hârtia de corespondență a Societății, una goală pe care mi-o dăduse Theo la arhivă ca să scriu etichete noi pentru dosare, pe care o adusesem acasă în geantă. Le-am ținut pe amândouă în dreptul lămpii, una lângă alta. Același crem. Aceeași greutate între degete. Aceleași dungi vergate vag presate în textură, acele riduri paralele fine pe care sita fabricantului de hârtie le lasă în urmă, ușor de văzut dacă știi să ții o foaie la lumină și să te uiți. Se potriveau. Bineînțeles că se potriveau. Biletul fusese scris pe hârtie luată din stocul lui Theo, teancul de pe tejgheaua clădirii pe care nu o părăsise de zile întregi.</w:t>
       </w:r>
     </w:p>
     <w:p>
@@ -4340,7 +4340,7 @@
     </w:p>
     <w:p>
       <w:r>
-        <w:t>Am stat nemișcată în lumina lămpii. Furtul broșei și cumpărarea hanului erau două secrete diferite, păstrate în două clădiri diferite. Theo îl avea pe unul dintre ele. Avea arhiva, scrisorile, fișa de catalog, antetul. El avea furtul. Dar dovada că banii furați deveniseră acest han iubit se afla la Primărie, în registrele funciare pe care o femeie rigidă și obosită mă privise în ochi și jurase că nu le citește niciodată.</w:t>
+        <w:t xml:space="preserve">Am stat nemișcată în lumina lămpii. Furtul broșei și cumpărarea hanului erau două secrete diferite, păstrate în două clădiri diferite. Theo îl avea pe unul dintre ele. Avea arhiva, scrisorile, fișa de catalog, hârtia. El știa de furt. Dar dovada că banii furați deveniseră acest han iubit se afla la Primărie, în registrele funciare pe care o femeie rigidă și obosită mă privise în ochi și jurase că nu le citește niciodată.</w:t>
       </w:r>
     </w:p>
     <w:p>
@@ -4429,7 +4429,7 @@
     <w:p/>
     <w:p>
       <w:r>
-        <w:t>Când s-a întors cu o copie a actului parcului, i-am mulțumit și am îndrugat chestiile mele plictisitoare de comitet despre comercianți și amplasarea tarabelor. Apoi mi-am luat tot timpul din lume ca să-l împăturesc și să-l pun în geantă. Am privit-o, iar acum, că știam la ce mă uit, îi puteam citi chipul cu ușurință. Nu era o femeie haină. Asta m-a lovit. Pe jumătate mă așteptasem, când aveam în sfârșit imaginea de ansamblu, să dau de ceva rece și lacom sub oboseală. Nu era nimic rece acolo, doar o teamă stinsă până la epuizare, teama adâncă, până în oase, a unui om care a făcut un lucru cu mult prea mare pentru puterile lui și stă treaz în fiecare noapte din cauza asta. Mâinile nu i-au fost stabile în timp ce îndrepta dosarele din coș. Două cești uitate de cafea stăteau reci pe birou. Arăta cum arătase și Fiona toată săptămâna, ca un om stors de viu, doar că ea era cea care storcea, și într-un fel asta era și mai trist.</w:t>
+        <w:t xml:space="preserve">Când s-a întors cu o copie a actului parcului, i-am mulțumit și am îndrugat chestiile mele plictisitoare de comitet despre comercianți și amplasarea tarabelor. Apoi mi-am luat tot timpul din lume ca să-l împăturesc și să-l pun în geantă. Am privit-o, iar acum, că știam la ce mă uit, îi puteam citi chipul cu ușurință. Nu era o femeie haină. Asta m-a lovit. Pe jumătate mă așteptasem, când aveam în sfârșit imaginea de ansamblu, să dau de ceva rece și lacom sub oboseală. Nu era nimic rece acolo, doar o teamă stinsă până la epuizare, teama adâncă, până în oase, a unei persoane care a făcut un lucru cu mult prea mare pentru puterile ei și stă trează în fiecare noapte din cauza asta. Mâinile nu i-au fost stabile în timp ce îndrepta dosarele din coș. Două cești uitate de cafea stăteau reci pe birou. Arăta cum arătase și Fiona toată săptămâna, ca un om stors de viu, doar că ea era cea care storcea, și într-un fel asta era și mai trist.</w:t>
       </w:r>
     </w:p>
     <w:p/>
@@ -4453,7 +4453,7 @@
     <w:p/>
     <w:p>
       <w:r>
-        <w:t>Ochii i se luminaseră și nu și-i putea ridica spre ai mei, la fel cum nu reușea oricând se vorbea cu voce tare despre vechea istorie. Am înțeles, stând acolo în palton cu actul parcului în geantă, că Vera Reed nu era nicio ticăloasă. Era o femeie speriată, atrasă într-o mașinație de un bărbat în care avusese încredere, sau de care îi era milă, sau poate ambele, și intrase acum prea adânc ca să mai poată da înapoi. Știa asta și nu dormea cu nimic mai bine decât femeia pe care ajuta s-o distrugă.</w:t>
+        <w:t xml:space="preserve">Ochii îi străluceau de lacrimi și nu și-i putea ridica spre ai mei, la fel cum nu reușea oricând se vorbea cu voce tare despre vechea istorie. Am înțeles, stând acolo în palton cu actul parcului în geantă, că Vera Reed nu era nicio ticăloasă. Era o femeie speriată, atrasă într-o mașinație de un bărbat în care avusese încredere, sau de care îi era milă, sau poate ambele, și intrase acum prea adânc ca să mai poată da înapoi. Știa asta și nu dormea cu nimic mai bine decât femeia pe care ajuta s-o distrugă.</w:t>
       </w:r>
     </w:p>
     <w:p/>
@@ -4465,7 +4465,7 @@
     <w:p/>
     <w:p>
       <w:r>
-        <w:t>Theo dăduse de furt. Găsise referirea în scrisorile lui Blackburn, broșa, piatra, casa de amanet. Le catalogase cu scrisul lui grijuliu, safirul din inima ei, și apoi sustrasese acele scrisori din dosare, declarându-le dispărute. Dar Theo, care se scufunda, supravegheat de tot orașul, niciodată pe acasă, n-ar fi putut să facă restul. N-ar fi putut să confirme că hanul fusese cumpărat cu banii aceia, pentru că dovada nu se afla în clădirea lui. Și n-ar fi putut să ducă biletele prin oraș și să lase câte unul pe un birou aglomerat în plină zi de festival, fiindcă Theo Hussein nu se putea plimba pe Bulevardul Evergreen neobservat nici să-i stea viața în joc.</w:t>
+        <w:t xml:space="preserve">Theo dăduse de furt. Găsise referirea în scrisorile familiei Blackburn, broșa, piatra, casa de amanet. Le catalogase cu scrisul lui grijuliu, safirul din inima ei, și apoi sustrasese acele scrisori din dosare, declarându-le dispărute. Dar Theo, care se scufunda, supravegheat de tot orașul, niciodată pe acasă, n-ar fi putut să facă restul. N-ar fi putut să confirme că hanul fusese cumpărat cu banii aceia, pentru că dovada nu se afla în clădirea lui. Și n-ar fi putut să ducă biletele prin oraș și să lase câte unul pe un birou aglomerat în plină zi de festival, fiindcă Theo Hussein nu se putea plimba pe Bulevardul Evergreen neobservat nici să-i stea viața în joc.</w:t>
       </w:r>
     </w:p>
     <w:p/>
@@ -4477,7 +4477,7 @@
     <w:p/>
     <w:p>
       <w:r>
-        <w:t>O făcuseră împreună. Theo pentru Societatea pe care o vedea cum moare cu zile. Vera pentru banii de care avea atâta nevoie, un salariu de orășel pentru munca dintr-un oraș mare și facturi despre care aproape că-mi spusese că nu le putea achita. Ori pentru el, în parte, dintr-o loialitate sau milă al cărei fund nu-l puteam ghici. N-aveam nevoie de motivele ei exacte. Structura era solidă.</w:t>
+        <w:t xml:space="preserve">O făcuseră împreună. Theo pentru Societatea pe care o vedea murind încetul cu încetul. Vera pentru banii de care avea atâta nevoie, un salariu de orășel pentru munca dintr-un oraș mare și facturi despre care aproape că-mi spusese că nu le putea achita. Ori pentru el, în parte, dintr-o loialitate sau milă al cărei fund nu-l puteam ghici. N-aveam nevoie de motivele ei exacte. Structura era solidă.</w:t>
       </w:r>
     </w:p>
     <w:p/>
@@ -4495,7 +4495,7 @@
     <w:p/>
     <w:p>
       <w:r>
-        <w:t>Găsisem adevărul. Acum urma partea mai grea, partea pe care nicio cantitate de viclenie n-o putea face în locul meu. Acum trebuia să aleg cum se va termina.</w:t>
+        <w:t xml:space="preserve">Găsisem adevărul. Acum urma partea mai grea, partea pe care nicio istețime n-o putea face în locul meu. Acum trebuia să aleg cum se va termina.</w:t>
       </w:r>
     </w:p>
     <w:p/>
@@ -4532,7 +4532,7 @@
     </w:p>
     <w:p>
       <w:r>
-        <w:t>Am stat multă vreme lângă foc și am întors-o pe toate fețele. Nick m-a lăsat. Pip a dormit lipită de piciorul meu și, în cele din urmă, am înțeles unde scârțâia calea cea ușoară.</w:t>
+        <w:t xml:space="preserve">Am stat multă vreme lângă foc și am întors-o pe toate fețele. Nick m-a lăsat. Pip dormea lipită de piciorul meu și, în cele din urmă, am înțeles unde scârțâia calea cea ușoară.</w:t>
       </w:r>
     </w:p>
     <w:p>
@@ -4574,7 +4574,7 @@
     </w:p>
     <w:p>
       <w:r>
-        <w:t>— Ăsta e drumul mai greu, a spus încet Nick. Mai ales pentru tine. Orașul o să sufere, Jess, și unii dintre ei o să regrete că n-ai lăsat lucrurile în pace, iar tu ești cea care va adăuga suferința pe capul lor. Vor ști că tu ai fost.</w:t>
+        <w:t xml:space="preserve">— Ăsta e drumul mai greu, a spus încet Nick. Mai ales pentru tine. Orașul o să sufere, Jess, și unii dintre ei o să regrete că n-ai lăsat lucrurile în pace, iar tu ești cea care le va fi adus suferința pe cap. Vor ști că tu ai fost.</w:t>
       </w:r>
     </w:p>
     <w:p>
@@ -4589,7 +4589,7 @@
     </w:p>
     <w:p>
       <w:r>
-        <w:t>N-aveam să câștig Frost Falls protejându-l de el însuși. Durerile lui Mark Redfern începuseră să se vindece abia când fuseseră înfruntate cu voce tare, cu tot orașul alături, și trebuia să facem la fel și acum.</w:t>
+        <w:t xml:space="preserve">N-aveam să câștig Frost Falls protejându-l de el însuși. Durerea lui Mark Redfern începuse să se vindece abia când fusese înfruntată cu voce tare, cu tot orașul alături, și trebuia să facem la fel și acum.</w:t>
       </w:r>
     </w:p>
     <w:p>
@@ -4796,7 +4796,7 @@
     <w:p/>
     <w:p>
       <w:r>
-        <w:t>— Vă rog să luați loc, amândoi, a spus Noriko, blând și măsurat. Nimeni nu este arestat. Nimeni nu are cătușe. O să stăm de vorbă, asta-i tot. Doamna Claus o să prezinte ce știe, iar apoi fiecare dintre voi va avea o alegere de făcut. Așezați-vă.</w:t>
+        <w:t xml:space="preserve">— Vă rog să luați loc, amândoi, a spus Noriko, blând și măsurat. Nimeni nu este arestat. Nimeni nu are cătușe. O să stăm de vorbă, asta-i tot. Doamna Claus o să prezinte ce știe, iar apoi fiecare dintre dumneavoastră va avea o alegere de făcut. Așezați-vă.</w:t>
       </w:r>
     </w:p>
     <w:p/>
@@ -4808,7 +4808,7 @@
     <w:p/>
     <w:p>
       <w:r>
-        <w:t>N-a fost ușor ce am făcut în continuare. Theo nu fusese niciodată decât amabil cu mine, iar să-i pun totul în față, urmărind cum se așază fiecare piesă, a fost printre cele mai grele lucruri pe care le făcusem vreodată. Dar eu alegeam lumina, iar lumina însemna să spun lucrurilor pe nume, așa că le-am spus pe nume. Mi-am ținut vocea cât de blândă am putut.</w:t>
+        <w:t xml:space="preserve">N-a fost ușor ce am făcut în continuare. Theo nu fusese niciodată decât amabil cu mine, iar să-i pun totul în față, urmărind cum se așază fiecare piesă, a fost printre cele mai grele lucruri pe care le făcusem vreodată. Dar alesesem lumina, iar lumina însemna să spun lucrurilor pe nume, așa că le-am spus pe nume. Mi-am ținut vocea cât de blândă am putut.</w:t>
       </w:r>
     </w:p>
     <w:p/>
@@ -4850,7 +4850,7 @@
     <w:p/>
     <w:p>
       <w:r>
-        <w:t>— Vera, am spus. Theo avea furtul. Dar biletele știau că hanul fusese cumpărat cu banii pe broșă, și asta n-a fost niciodată în nicio scrisoare Blackburn. Aia e o înregistrare de proprietate. Un act. Iar actul pentru acest han era scos din sertar în coșul dumneavoastră de recatalogare ieri dimineață, atins, pe biroul unei femei care îmi spusese de două ori că nu citește niciodată registrele din spatele ei. — Mi-am ținut vocea blândă. — El avea furtul. Dumneavoastră aveați actul. Și aveați picioarele, Vera. El n-ar fi putut să străbată acest oraș neobservat nici să-și fi dat viața, toată lumea îl știe pe Theo, toată lumea îl oprește. Dar nimănui nu i se pare ciudat ca secretara primarului să dea o fugă pe la han în timpul festivalului. Am trecut chiar eu pe lângă dumneavoastră pe trepte în dimineața aia, cu permisele de parcare. N-ar fi putut s-o facă singur. Avea nevoie de cineva care să se poată mișca prin oraș nevăzut. Aceea ați fost dumneavoastră.</w:t>
+        <w:t xml:space="preserve">— Vera, am spus. Theo deținea secretul furtului. Dar biletele știau că hanul fusese cumpărat cu banii pe broșă, și asta n-a fost niciodată în nicio scrisoare Blackburn. Aia e o înregistrare de proprietate. Un act. Iar actul pentru acest han era scos din sertar în coșul dumneavoastră de recatalogare ieri dimineață, atins, pe biroul unei femei care îmi spusese de două ori că nu citește niciodată registrele din spatele ei. — Mi-am ținut vocea blândă. — El deținea secretul furtului. Dumneavoastră dețineați actul. Și aveați picioarele, Vera. El n-ar fi putut să străbată acest oraș neobservat nici dacă i-ar fi depins viața de asta, toată lumea îl știe pe Theo, toată lumea îl oprește. Dar nimănui nu i se pare ciudat ca secretara primarului să dea o fugă pe la han în timpul festivalului. Am trecut chiar eu pe lângă dumneavoastră pe trepte în dimineața aia, cu permisele de parcare. N-ar fi putut s-o facă singur. Avea nevoie de cineva care să se poată mișca prin oraș nevăzut. Aceea ați fost dumneavoastră.</w:t>
       </w:r>
     </w:p>
     <w:p/>
@@ -4880,7 +4880,7 @@
     <w:p/>
     <w:p>
       <w:r>
-        <w:t>— Foarte bine, a spus ea. Ați recunoscut amândoi, de bunăvoie, și asta contează mai mult decât puteți voi ști încă. Acum vorbim despre ce urmează. Pentru că a recunoaște un lucru este începutul îndreptării lui. Nu e și sfârșitul. Sfârșitul este mult mai lung și începe mâine.</w:t>
+        <w:t xml:space="preserve">— Foarte bine, a spus ea. Ați recunoscut amândoi, de bunăvoie, și asta contează mai mult decât vă puteți da seama încă. Acum vorbim despre ce urmează. Pentru că a recunoaște un lucru este începutul îndreptării lui. Nu e și sfârșitul. Sfârșitul este mult mai lung și începe mâine.</w:t>
       </w:r>
     </w:p>
     <w:p>
@@ -4921,7 +4921,7 @@
     <w:p/>
     <w:p>
       <w:r>
-        <w:t>Pentru Vera, asta însemna să dea înapoi ce putea, în rate pe care le va resimți în oase în fiecare lună, o lungă perioadă de supraveghere și plecarea din primărie. Și-a dat demisia în săptămâna de după. A fost lucrul corect de făcut și a costat-o scump, deoarece, în ciuda faptului că primarul o plătea prost, biroul acela îi fusese locul ei în acest oraș timp de cincisprezece ani. M-a apăsat. Eu fusesem cea care declanșase totul. A avut un cost real, iar eu m-am obligat să-l privesc direct, fără să întorc privirea.</w:t>
+        <w:t xml:space="preserve">Pentru Vera, asta însemna să dea înapoi ce putea, în rate pe care avea să le resimtă în oase în fiecare lună, o lungă perioadă de supraveghere și plecarea din primărie. Și-a dat demisia în săptămâna de după. A fost lucrul corect de făcut și a costat-o scump, deoarece, în ciuda faptului că primarul o plătea prost, biroul acela îi fusese locul ei în acest oraș timp de cincisprezece ani. M-a apăsat. Eu fusesem cea care declanșase totul. A avut un cost real, iar eu m-am obligat să-l privesc direct, fără să întorc privirea.</w:t>
       </w:r>
     </w:p>
     <w:p/>
@@ -4933,7 +4933,7 @@
     <w:p/>
     <w:p>
       <w:r>
-        <w:t>A demisionat. Nu pentru un sezon, ca să fie strecurat înapoi în scaun pe furiș de îndată ce orașul s-ar fi săturat să fie furios. A demisionat din funcția de președinte al Societății de Istorie din Frost Falls, iar consiliul de administrație, odată ce a aflat totul, i-a acceptat demisia și a vorbit serios. Un om nu putea șantaja un vecin folosindu-se de colecția și hârtia cu antet ale Societății, ca apoi să păstreze cheile locului respectiv.</w:t>
+        <w:t xml:space="preserve">A demisionat. Nu pentru un sezon, ca să fie strecurat înapoi în scaun pe furiș de îndată ce orașul s-ar fi săturat să fie furios. A demisionat din funcția de președinte al Societății de Istorie din Frost Falls, iar consiliul de administrație, odată ce a aflat totul, i-a acceptat demisia și a vorbit serios. Un om nu putea șantaja un vecin folosindu-se de colecția și hârtia de corespondență ale Societății, ca apoi să păstreze cheile locului respectiv.</w:t>
       </w:r>
     </w:p>
     <w:p/>
@@ -4993,7 +4993,7 @@
     <w:p/>
     <w:p>
       <w:r>
-        <w:t xml:space="preserve">Lucrul pentru a cărui salvare greșise continua să se prăbușească. Și acum, odată cu plecarea lui, trebuia salvat așa cum trebuie, de către oraș, pentru orașul în sine. Altfel, nu va fi salvat nicicum.</w:t>
+        <w:t xml:space="preserve">Lucrul pentru a cărui salvare greșise continua să se prăbușească. Și acum, odată cu plecarea lui, trebuia salvat așa cum trebuie, de către oraș, pentru orașul în sine. Altfel, n-avea să fie salvat deloc.</w:t>
       </w:r>
     </w:p>
     <w:p>
@@ -5044,7 +5044,7 @@
     </w:p>
     <w:p>
       <w:r>
-        <w:t>— În acest oraș tocmai s-a întâmplat ceva urât, am continuat, pentru că un om bun a decis că salvarea Societății justifică orice, că o salvare merită o faptă rea, că scopul va scuza mijloacele. Acum. Dacă Societatea este salvată săptămâna viitoare prin carnetul de cecuri al unui străin aflat în trecere, oricât de binevoitor, atunci lecția pe care o învață în tăcere întregul oraș este că Theo a avut dreptate cel puțin în privința unui singur lucru. Că supraviețuirea clădirii este ceva care vine din exterior, prin bani, printr-o scurtătură, prin intermediul unui binefăcător, și nu ceva ce orașul însuși trebuie să își dorească, pentru care trebuie să muncească și pe care trebuie să-l câștige. — Am clătinat din cap. — O Societate salvată de un oaspete generos este doar amânată, domnule Worthington. Va fi în aceeași gaură peste cinci ani, așteptând ca următorul vizitator bogat să prindă drag de cuverturi. Singurul mod în care locul acesta este cu adevărat în siguranță este dacă Frost Falls decide singur că merită salvat și îl salvează cu propria mână, din propriile buzunare, oricât de subțiri ar fi ele. Asta durează mai mult. Este mult mai greu. Dar este varianta care dăinuie și vindecă ceea ce tocmai s-a întâmplat aici, în loc să lipească un afiș vesel deasupra.</w:t>
+        <w:t xml:space="preserve">— În acest oraș tocmai s-a întâmplat ceva urât, am continuat, pentru că un om bun a decis că salvarea Societății justifică orice, că o salvare merită o faptă rea, că scopul va scuza mijloacele. Acum. Dacă Societatea este salvată săptămâna viitoare prin carnetul de cecuri al unui străin aflat în trecere, oricât de binevoitor, atunci lecția pe care o învață în tăcere întregul oraș este că Theo a avut dreptate cel puțin în privința unui singur lucru. Că supraviețuirea clădirii este ceva care vine din exterior, prin bani, printr-o scurtătură, prin intermediul unui binefăcător, și nu ceva ce orașul însuși trebuie să își dorească, pentru care trebuie să muncească și pe care trebuie să-l câștige. — Am clătinat din cap. — O Societate salvată de un oaspete generos este doar amânată, domnule Worthington. Va fi în aceeași gaură peste cinci ani, așteptând ca următorul vizitator bogat să prindă drag de plăpumi. Singurul mod în care locul acesta este cu adevărat în siguranță este dacă Frost Falls decide singur că merită salvat și îl salvează cu propria mână, din propriile buzunare, oricât de subțiri ar fi ele. Asta durează mai mult. Este mult mai greu. Dar este varianta care dăinuie și vindecă ceea ce tocmai s-a întâmplat aici, în loc să lipească un afiș vesel deasupra.</w:t>
       </w:r>
     </w:p>
     <w:p>
@@ -5069,7 +5069,7 @@
     </w:p>
     <w:p>
       <w:r>
-        <w:t>— Îmi place asta, a spus ea. Îmi place mult mai mult așa, Gerald. Ne-am cumpărat drumul în destule lucruri de-a lungul anilor. Ar fi o noutate, la vârsta noastră, să fim invitați în unul singur.</w:t>
+        <w:t xml:space="preserve">— Îmi place asta, a spus ea. Îmi place mult mai mult așa, Gerald. Ne-am cumpărat drumul în destule lucruri de-a lungul anilor. Ar fi o noutate, la vârsta noastră, să fim invitați într-unul.</w:t>
       </w:r>
     </w:p>
     <w:p>
@@ -5122,7 +5122,7 @@
     <w:p/>
     <w:p>
       <w:r>
-        <w:t xml:space="preserve">— M-am gândit la ce-ai spus, mi-a zis, înainte chiar să-și fi dat jos paltonul. Că mi-a fost frică de secretul greșit. Că ascunzișul îi dăduse colții. </w:t>
+        <w:t xml:space="preserve">— M-am gândit la ce-ai spus, mi-a zis, înainte chiar să-și fi dat jos paltonul. Că mi-a fost frică de secretul greșit. Că ascunderea îi dăduse colții. </w:t>
       </w:r>
     </w:p>
     <w:p/>
@@ -5134,7 +5134,7 @@
     <w:p/>
     <w:p>
       <w:r>
-        <w:t>— Am terminat cu ascunzișul, Jessica. Toți anii aceștia am fost păstrătoarea unui lucru rușinos, și se dovedește că lucrul nici măcar nu e rușinos, nu când e spus pe de-a întregul. E doar trist, și omenesc, și vechi de o sută de ani. Așa că am de gând să-l spun. Cum trebuie. Cu voce tare. Înainte ca cineva să-l mai poată folosi vreodată împotriva mea. Nu poți șantaja o femeie cu un secret pe care l-a spus deja ea însăși întregului oraș.</w:t>
+        <w:t xml:space="preserve">— Am terminat cu ascunsul, Jessica. Toți anii aceștia am fost păstrătoarea unui lucru rușinos, și se dovedește că lucrul nici măcar nu e rușinos, nu când e spus pe de-a întregul. E doar trist, și omenesc, și vechi de o sută de ani. Așa că am de gând să-l spun. Cum trebuie. Cu voce tare. Înainte ca cineva să-l mai poată folosi vreodată împotriva mea. Nu poți șantaja o femeie cu un secret pe care l-a spus deja ea însăși întregului oraș.</w:t>
       </w:r>
     </w:p>
     <w:p/>
@@ -5207,7 +5207,7 @@
     <w:p/>
     <w:p>
       <w:r>
-        <w:t>Sam Patel și-a ridicat pălăria spre mine de-a curmezișul bulevardului Evergreen. Chiar și Noriko, care era zgârcită cu laudele, mi-a spus la o cafea că mă descurcasem mai bine decât majoritatea oamenilor antrenați cu care lucrase în cariera ei, că găsisem o cale blândă printr-o chestiune care are aproape întotdeauna numai căi reci.</w:t>
+        <w:t xml:space="preserve">Sam Patel și-a ridicat șapca spre mine de-a curmezișul Bulevardului Evergreen. Chiar și Noriko, care era zgârcită cu laudele, mi-a spus la o cafea că mă descurcasem mai bine decât majoritatea oamenilor antrenați cu care lucrase în cariera ei, că găsisem o cale blândă printr-o chestiune care are aproape întotdeauna numai căi reci.</w:t>
       </w:r>
     </w:p>
     <w:p/>
@@ -5294,7 +5294,7 @@
     <w:p/>
     <w:p>
       <w:r>
-        <w:t>În mai puțin de o oră, jumătate din Frost Falls stătea în parc, în jurul marelui ulm, cu lopeți și felinare, într-o tăcere încordată, plină de suflare, cum nu mai auzisem niciodată de la acest oraș zgomotos și prietenos.</w:t>
+        <w:t xml:space="preserve">În mai puțin de o oră, jumătate din Frost Falls stătea în parc, în jurul marelui ulm, cu lopeți și felinare, într-o tăcere încordată, cu sufletul la gură, cum nu mai auzisem niciodată de la acest oraș zgomotos și prietenos.</w:t>
       </w:r>
     </w:p>
     <w:p/>
@@ -5312,7 +5312,7 @@
     <w:p/>
     <w:p>
       <w:r>
-        <w:t>— N-o deschideți, a spus Noriko înainte ca mâinile cuiva să apuce să se întindă, și a zis-o blând, dar ferm, având în ea deopotrivă autoritatea polițistei și înțelepciunea femeii bătrâne. Nu în seara asta, nu așa, pe întuneric, cu lopeți și toată lumea înghețată. E acolo jos de o sută de ani. Poate să mai aștepte până la Anul Nou ca să fie deschisă cum se cuvine. O vom face ca la carte. Tot orașul, la lumina zilei. — Mi-a întâlnit privirea peste lumina felinarului și n-a mai desprins-o. — Cu Theo de față.</w:t>
+        <w:t xml:space="preserve">— N-o deschideți, a spus Noriko înainte ca mâinile cuiva să apuce să se întindă, și a zis-o blând, dar ferm, având în ea deopotrivă autoritatea șefei de poliție și înțelepciunea unei femei cu scaun la cap. — Nu în seara asta, nu așa, pe întuneric, cu lopeți și toată lumea înghețată. E acolo jos de o sută de ani. Poate să mai aștepte până la Anul Nou ca să fie deschisă cum se cuvine. O vom face ca la carte. Tot orașul, la lumina zilei. — Mi-a întâlnit privirea peste lumina felinarului și n-a mai desprins-o. — Cu Theo de față.</w:t>
       </w:r>
     </w:p>
     <w:p/>
@@ -5324,7 +5324,7 @@
     <w:p/>
     <w:p>
       <w:r>
-        <w:t>— Doar a găsit jumătate din drumul spre ea, la urma urmei, a continuat Noriko, chiar dacă a luat-o pe ocolite până a dat de ea. A dedicat treizeci de ani din viață aflând unde sunt îngropate lucrurile prin orașul ăsta. Ar trebui să fie și el acolo când lucrul ăsta va ieși la lumină. S-ar putea să fie primul lucru bun în preajma căruia ajunge să stea după atâta timp. Și să stea lângă un lucru bun la care nu poate pretinde niciun merit ar putea fi exact leacul de care are nevoie.</w:t>
+        <w:t xml:space="preserve">— Doar a găsit jumătate din drumul spre ea, la urma urmei, a continuat Noriko, chiar dacă a ajuns la ea pe calea greșită. A dedicat treizeci de ani din viață aflând unde sunt îngropate lucrurile prin orașul ăsta. Ar trebui să fie și el acolo când lucrul ăsta va ieși la lumină. S-ar putea să fie primul lucru bun în preajma căruia ajunge să stea după atâta timp. Și să stea lângă un lucru bun la care nu poate pretinde niciun merit ar putea fi exact leacul de care are nevoie.</w:t>
       </w:r>
     </w:p>
     <w:p/>
@@ -5398,7 +5398,7 @@
     <w:p/>
     <w:p>
       <w:r>
-        <w:t>Într-o seară din săptămâna aceea, le-am condus acasă pe Emma și pe Snowball, cu Pip legănându-se înaintea noastră și cu Mark alături de mine. Emma a vorbit pe tot parcursul drumului, ca de obicei, despre cutia de aramă și despre ce s-ar putea afla în interiorul ei. Monede, credea ea. Sau o scrisoare. Sau o comoară, o comoară adevărată, aur, spera ea, și oare o să aibă voie tot orașul să se uite, și oare putea sta în față de tot când o vor deschide, la urma urmei ea fusese chiar acolo când fusese scoasă din pământ și asta trebuia să însemne ceva, nu-i așa?</w:t>
+        <w:t xml:space="preserve">Într-o seară din săptămâna aceea, i-am condus acasă pe Emma și pe Snowball, cu Pip legănându-se înaintea noastră și cu Mark alături de mine. Emma a vorbit pe tot parcursul drumului, cum făcea acum, despre cutia de aramă și despre ce s-ar putea afla în interiorul ei. Monede, credea ea. Sau o scrisoare. Sau o comoară, o comoară adevărată, aur, spera ea, și oare o să aibă voie tot orașul să se uite, și oare putea sta în față de tot când o vor deschide, la urma urmei ea fusese chiar acolo când fusese scoasă din pământ și asta trebuia să însemne ceva, nu-i așa?</w:t>
       </w:r>
     </w:p>
     <w:p/>
@@ -5440,7 +5440,7 @@
     <w:p/>
     <w:p>
       <w:r>
-        <w:t xml:space="preserve">La poarta familiei Redfern, Emma i-a îndesat lesa lui Snowball în mână. </w:t>
+        <w:t xml:space="preserve">La poarta familiei Redfern, Emma mi-a îndesat în mână lesa lui Snowball. </w:t>
       </w:r>
     </w:p>
     <w:p>
@@ -5557,7 +5557,7 @@
     <w:p/>
     <w:p>
       <w:r>
-        <w:t>Nick mă aștepta treaz când am ajuns acasă. M-a luat de mână la ușă și m-a condus fără un cuvânt prin curtea rece până la atelier, apoi l-a deschis. Vatra pe care o construise strălucea în mijlocul încăperii, pietrele rotunde de râu erau calde și aurii, iar magia plutea deasupra căminului gol în cercuri lente. Era mai multă decât fusese înainte.</w:t>
+        <w:t xml:space="preserve">Nick mă aștepta treaz când am ajuns acasă. M-a luat de mână la ușă și m-a condus fără un cuvânt prin curtea rece până la atelier, apoi l-a deschis. Vatra pe care o construise strălucea în mijlocul încăperii, pietrele rotunde de râu erau calde și aurii, iar magia plutea deasupra grătarului gol în cercuri lente. Era mai multă decât fusese înainte.</w:t>
       </w:r>
     </w:p>
     <w:p/>
@@ -5575,7 +5575,7 @@
     <w:p/>
     <w:p>
       <w:r>
-        <w:t>M-am rezemat de el și am privit aurul făcându-și cercurile lente deasupra vetrei și m-am gândit la iarna care venea. Societatea încă era pe buza prăpastiei, urmând să fie salvată așa cum trebuie sau deloc, cu un sezon întreg de târguri de prăjituri și generozitate mică și încăpățânată înainte ca cineva să afle ceva. Cutia de aramă sigilată în camera din față a Societății până la Anul Nou. Vera și Theo, amândoi parcurgându-și drumurile lungi înapoi, centimetru cu centimetru, cu greu. Magia, așezându-se acum, dar nu pe deplin așezată, încă scânteind în lumini și zăvoare peste tot prin oraș. Atât de multe lucruri neterminate. Atât de multe încă de făcut.</w:t>
+        <w:t xml:space="preserve">M-am rezemat de el și am privit aurul făcându-și cercurile lente deasupra grătarului și m-am gândit la iarna care venea. Societatea încă era pe buza prăpastiei, urmând să fie salvată așa cum trebuie sau deloc, cu un sezon întreg de târguri de prăjituri și generozitate mică și încăpățânată înainte ca cineva să afle ceva. Cutia de aramă sigilată în camera din față a Societății până la Anul Nou. Vera și Theo, amândoi parcurgându-și drumurile lungi înapoi, centimetru cu centimetru, cu greu. Magia, așezându-se acum, dar nu pe deplin așezată, încă scânteind în lumini și zăvoare peste tot prin oraș. Atât de multe lucruri neterminate. Atât de multe încă de făcut.</w:t>
       </w:r>
     </w:p>
     <w:p/>

</xml_diff>